<commit_message>
Write full introduction including background and problem statement
</commit_message>
<xml_diff>
--- a/014 fase 4 - report/Rapport prøving.docx
+++ b/014 fase 4 - report/Rapport prøving.docx
@@ -33,7 +33,7 @@
                     </pic:cNvPicPr>
                   </pic:nvPicPr>
                   <pic:blipFill>
-                    <a:blip r:embed="rId10">
+                    <a:blip r:embed="rId11">
                       <a:extLst>
                         <a:ext uri="{28A0092B-C50C-407E-A947-70E740481C1C}">
                           <a14:useLocalDpi xmlns:a14="http://schemas.microsoft.com/office/drawing/2010/main" val="0"/>
@@ -78,8 +78,8 @@
     <w:p>
       <w:pPr>
         <w:sectPr>
-          <w:footerReference w:type="even" r:id="rId11"/>
-          <w:footerReference w:type="default" r:id="rId12"/>
+          <w:footerReference w:type="even" r:id="rId12"/>
+          <w:footerReference w:type="default" r:id="rId13"/>
           <w:pgSz w:w="11907" w:h="16840" w:code="9"/>
           <w:pgMar w:top="1411" w:right="1440" w:bottom="1411" w:left="994" w:header="708" w:footer="403" w:gutter="0"/>
           <w:pgNumType w:start="1"/>
@@ -731,7 +731,7 @@
                     </pic:cNvPicPr>
                   </pic:nvPicPr>
                   <pic:blipFill>
-                    <a:blip r:embed="rId13">
+                    <a:blip r:embed="rId14">
                       <a:extLst>
                         <a:ext uri="{28A0092B-C50C-407E-A947-70E740481C1C}">
                           <a14:useLocalDpi xmlns:a14="http://schemas.microsoft.com/office/drawing/2010/main" val="0"/>
@@ -1718,7 +1718,7 @@
               </w:rPr>
               <w:t xml:space="preserve"> og kan medføre annullering av eksamen og utestengelse fra universiteter og høgskoler i Norge, jf. </w:t>
             </w:r>
-            <w:hyperlink r:id="rId14" w:history="1">
+            <w:hyperlink r:id="rId15" w:history="1">
               <w:r>
                 <w:rPr>
                   <w:rStyle w:val="Hyperkobling"/>
@@ -1742,7 +1742,7 @@
               </w:rPr>
               <w:t xml:space="preserve"> §§4-7 og 4-8 og </w:t>
             </w:r>
-            <w:hyperlink r:id="rId15" w:history="1">
+            <w:hyperlink r:id="rId16" w:history="1">
               <w:r>
                 <w:rPr>
                   <w:rStyle w:val="Hyperkobling"/>
@@ -1981,7 +1981,7 @@
               </w:rPr>
               <w:t xml:space="preserve"> </w:t>
             </w:r>
-            <w:hyperlink r:id="rId16" w:history="1">
+            <w:hyperlink r:id="rId17" w:history="1">
               <w:r>
                 <w:rPr>
                   <w:rStyle w:val="Hyperkobling"/>
@@ -2167,7 +2167,7 @@
               </w:rPr>
               <w:t xml:space="preserve"> mistanke om fusk etter høgskolens </w:t>
             </w:r>
-            <w:hyperlink r:id="rId17" w:history="1">
+            <w:hyperlink r:id="rId18" w:history="1">
               <w:r>
                 <w:rPr>
                   <w:rStyle w:val="Hyperkobling"/>
@@ -2346,7 +2346,7 @@
               </w:rPr>
               <w:t xml:space="preserve">satt oss inn i regler og retningslinjer i bruk av </w:t>
             </w:r>
-            <w:hyperlink r:id="rId18" w:history="1">
+            <w:hyperlink r:id="rId19" w:history="1">
               <w:r>
                 <w:rPr>
                   <w:rStyle w:val="Hyperkobling"/>
@@ -6807,25 +6807,39 @@
     <w:p/>
     <w:p>
       <w:r>
-        <w:t xml:space="preserve">Nedetid har ikke bare tapte inntekter i form av at det er tapte charterdager, men har også indirekte effekt på produksjonen til operatørene, kan få kontrakts sanksjoner og en svekket konkurranseevne i forhold til andre rederier i et allerede volatilt marked. Videre så har offshoremarkedet opplevd betydelige svingninger i etterspørsel og rate på fartøyene, noe som forsterker behovet for bedre beslutningstøtte i flåten. </w:t>
-      </w:r>
-      <w:r>
-        <w:fldChar w:fldCharType="begin"/>
-      </w:r>
-      <w:r>
-        <w:instrText xml:space="preserve"> CITATION Men261 \l 1044 </w:instrText>
-      </w:r>
-      <w:r>
-        <w:fldChar w:fldCharType="separate"/>
-      </w:r>
-      <w:r>
-        <w:rPr>
-          <w:noProof/>
-        </w:rPr>
-        <w:t>(Menon Economics, 2026)</w:t>
-      </w:r>
-      <w:r>
-        <w:fldChar w:fldCharType="end"/>
+        <w:t>Nedetid har ikke bare tapte inntekter i form av at det er tapte charterdager, men har også indirekte effekt på produksjonen til operatørene, kan få kontrakts sanksjoner og en svekket konkurranseevne i forhold til andre rederier i et allerede volatilt marked. Videre så har offshoremarkedet opplevd betydelige svingninger i etterspørsel og rate på fartøyene, noe som forsterker behovet for bedre beslutningstøtte i flåten</w:t>
+      </w:r>
+      <w:r>
+        <w:t xml:space="preserve"> </w:t>
+      </w:r>
+      <w:sdt>
+        <w:sdtPr>
+          <w:id w:val="1365796036"/>
+          <w:citation/>
+        </w:sdtPr>
+        <w:sdtContent>
+          <w:r>
+            <w:fldChar w:fldCharType="begin"/>
+          </w:r>
+          <w:r>
+            <w:instrText xml:space="preserve"> CITATION Men262 \l 1044 </w:instrText>
+          </w:r>
+          <w:r>
+            <w:fldChar w:fldCharType="separate"/>
+          </w:r>
+          <w:r>
+            <w:rPr>
+              <w:noProof/>
+            </w:rPr>
+            <w:t>(Menon Economics, 2026)</w:t>
+          </w:r>
+          <w:r>
+            <w:fldChar w:fldCharType="end"/>
+          </w:r>
+        </w:sdtContent>
+      </w:sdt>
+      <w:r>
+        <w:t xml:space="preserve">. </w:t>
       </w:r>
     </w:p>
     <w:p/>
@@ -6845,6 +6859,35 @@
       </w:r>
       <w:proofErr w:type="spellEnd"/>
       <w:r>
+        <w:t xml:space="preserve"> </w:t>
+      </w:r>
+      <w:sdt>
+        <w:sdtPr>
+          <w:id w:val="877748473"/>
+          <w:citation/>
+        </w:sdtPr>
+        <w:sdtContent>
+          <w:r>
+            <w:fldChar w:fldCharType="begin"/>
+          </w:r>
+          <w:r>
+            <w:instrText xml:space="preserve"> CITATION Jos26 \l 1044 </w:instrText>
+          </w:r>
+          <w:r>
+            <w:fldChar w:fldCharType="separate"/>
+          </w:r>
+          <w:r>
+            <w:rPr>
+              <w:noProof/>
+            </w:rPr>
+            <w:t>(Noble, 2026)</w:t>
+          </w:r>
+          <w:r>
+            <w:fldChar w:fldCharType="end"/>
+          </w:r>
+        </w:sdtContent>
+      </w:sdt>
+      <w:r>
         <w:t xml:space="preserve">. </w:t>
       </w:r>
       <w:r>
@@ -6864,986 +6907,547 @@
       <w:r>
         <w:t xml:space="preserve"> sammenhenger mellom forklaringsvariablene. De siste tiårene har maskinlæring fått større oppmerksomhet innen </w:t>
       </w:r>
+      <w:r>
+        <w:t>prognostisering</w:t>
+      </w:r>
+      <w:r>
+        <w:t xml:space="preserve"> og beslutningsstøtte. Studier innen logistikk har vist at maskinlæringsmodeller i flere tilfeller kan oppnå høyere prediksjonsnøyaktighet enn tradisjonelle metoder</w:t>
+      </w:r>
+      <w:r>
+        <w:t xml:space="preserve"> </w:t>
+      </w:r>
+      <w:sdt>
+        <w:sdtPr>
+          <w:id w:val="1948116890"/>
+          <w:citation/>
+        </w:sdtPr>
+        <w:sdtContent>
+          <w:r>
+            <w:fldChar w:fldCharType="begin"/>
+          </w:r>
+          <w:r>
+            <w:instrText xml:space="preserve"> CITATION Rea06 \l 1044 </w:instrText>
+          </w:r>
+          <w:r>
+            <w:fldChar w:fldCharType="separate"/>
+          </w:r>
+          <w:r>
+            <w:rPr>
+              <w:noProof/>
+            </w:rPr>
+            <w:t>(Real Carbonneau, 2006)</w:t>
+          </w:r>
+          <w:r>
+            <w:fldChar w:fldCharType="end"/>
+          </w:r>
+        </w:sdtContent>
+      </w:sdt>
+      <w:r>
+        <w:t xml:space="preserve">. </w:t>
+      </w:r>
+      <w:r>
+        <w:t xml:space="preserve">Resultatene fra M4- konkurransen indikerer også at kombinasjoner av statistiske og maskinlæringsbaserte </w:t>
+      </w:r>
+      <w:r>
+        <w:t>metoder</w:t>
+      </w:r>
+      <w:r>
+        <w:t xml:space="preserve"> kan gi forbedrede prognoser</w:t>
+      </w:r>
+      <w:r>
+        <w:t xml:space="preserve"> </w:t>
+      </w:r>
+      <w:sdt>
+        <w:sdtPr>
+          <w:id w:val="132384802"/>
+          <w:citation/>
+        </w:sdtPr>
+        <w:sdtContent>
+          <w:r>
+            <w:fldChar w:fldCharType="begin"/>
+          </w:r>
+          <w:r>
+            <w:instrText xml:space="preserve"> CITATION Spy18 \l 1044 </w:instrText>
+          </w:r>
+          <w:r>
+            <w:fldChar w:fldCharType="separate"/>
+          </w:r>
+          <w:r>
+            <w:rPr>
+              <w:noProof/>
+            </w:rPr>
+            <w:t>(Spyros Makridakis, 2018)</w:t>
+          </w:r>
+          <w:r>
+            <w:fldChar w:fldCharType="end"/>
+          </w:r>
+        </w:sdtContent>
+      </w:sdt>
+      <w:r>
+        <w:t xml:space="preserve">. </w:t>
+      </w:r>
+    </w:p>
+    <w:p/>
+    <w:p>
+      <w:r>
+        <w:t>Innen maritim sektor har forskning på kunstig intelligens i stor grad vært rettet mot energieffekt</w:t>
+      </w:r>
+      <w:r>
+        <w:t>ivitet og operasjonelle optimaliseringer</w:t>
+      </w:r>
+      <w:r>
+        <w:t xml:space="preserve"> </w:t>
+      </w:r>
+      <w:sdt>
+        <w:sdtPr>
+          <w:id w:val="603085664"/>
+          <w:citation/>
+        </w:sdtPr>
+        <w:sdtContent>
+          <w:r>
+            <w:fldChar w:fldCharType="begin"/>
+          </w:r>
+          <w:r>
+            <w:instrText xml:space="preserve"> CITATION Nur23 \l 1044 </w:instrText>
+          </w:r>
+          <w:r>
+            <w:fldChar w:fldCharType="separate"/>
+          </w:r>
+          <w:r>
+            <w:rPr>
+              <w:noProof/>
+            </w:rPr>
+            <w:t>(Nur Assani, 2023)</w:t>
+          </w:r>
+          <w:r>
+            <w:fldChar w:fldCharType="end"/>
+          </w:r>
+        </w:sdtContent>
+      </w:sdt>
+      <w:r>
+        <w:t xml:space="preserve">. Bruken av maskinlæring for prediksjon av operasjonell nedetid i offshoreflåter er derimot mindre undersøkt. </w:t>
+      </w:r>
+      <w:r>
+        <w:t xml:space="preserve">Dette </w:t>
+      </w:r>
+      <w:r>
+        <w:t xml:space="preserve">aktualiserer behovet for å undersøke om og i hvilken </w:t>
+      </w:r>
+      <w:r>
+        <w:t>form</w:t>
+      </w:r>
+      <w:r>
+        <w:t xml:space="preserve"> </w:t>
+      </w:r>
+      <w:r>
+        <w:t>maskins læringsmodeller</w:t>
+      </w:r>
+      <w:r>
+        <w:t xml:space="preserve"> kan bidra </w:t>
+      </w:r>
+      <w:r>
+        <w:t xml:space="preserve">til </w:t>
+      </w:r>
+      <w:r>
+        <w:t xml:space="preserve">prediksjon av </w:t>
+      </w:r>
       <w:proofErr w:type="spellStart"/>
       <w:r>
-        <w:t>prognostiering</w:t>
+        <w:t>offhire</w:t>
       </w:r>
       <w:proofErr w:type="spellEnd"/>
       <w:r>
-        <w:t xml:space="preserve"> og beslutningsstøtte. Studier innen logistikk har vist at maskinlæringsmodeller i flere tilfeller kan oppnå høyere prediksjonsnøyaktighet enn tradisjonelle metoder. Dette gjelder spesielt i situasjoner der datasettene har gøy kompleksitet. Resultatene fra M4- konkurransen indikerer også at kombinasjoner av statistiske og maskinlæringsbaserte </w:t>
-      </w:r>
-      <w:proofErr w:type="spellStart"/>
-      <w:r>
-        <w:t>metider</w:t>
-      </w:r>
-      <w:proofErr w:type="spellEnd"/>
-      <w:r>
-        <w:t xml:space="preserve"> kan gi forbedrede prognoser. </w:t>
-      </w:r>
-    </w:p>
-    <w:p/>
-    <w:p>
-      <w:r>
-        <w:t>Innen maritim sektor har forskning på kunstig intelligens i stor grad vært rettet mot energieffekt</w:t>
-      </w:r>
-      <w:r>
-        <w:t xml:space="preserve">ivitet og operasjonelle optimaliseringer. Bruken av maskinlæring for prediksjon av operasjonell nedetid i offshoreflåter er derimot mindre undersøkt. </w:t>
-      </w:r>
-      <w:r>
-        <w:t xml:space="preserve">Litteraturen indikerer dermed et </w:t>
-      </w:r>
-      <w:proofErr w:type="spellStart"/>
-      <w:r>
-        <w:t>forskningsgap</w:t>
-      </w:r>
-      <w:proofErr w:type="spellEnd"/>
-      <w:r>
-        <w:t xml:space="preserve"> </w:t>
-      </w:r>
-      <w:r>
-        <w:t xml:space="preserve">i skjæringspunktet mellom logistikk, maskinlæring og operasjonell risikostyring i offshore segmentet. </w:t>
-      </w:r>
-    </w:p>
-    <w:p/>
-    <w:p>
+        <w:t xml:space="preserve"> hendelser sammenlignet med tradisjonelle statistiske modeller. </w:t>
+      </w:r>
+    </w:p>
+    <w:p>
+      <w:pPr>
+        <w:pStyle w:val="Overskrift2"/>
+      </w:pPr>
+      <w:bookmarkStart w:id="17" w:name="_Toc222057404"/>
       <w:r>
         <w:lastRenderedPageBreak/>
-        <w:t xml:space="preserve">Dette gapet aktualiserer behovet for å undersøke om og i hvilken fra </w:t>
-      </w:r>
-      <w:r>
-        <w:t>maskins læringsmodeller</w:t>
-      </w:r>
-      <w:r>
-        <w:t xml:space="preserve"> kan bidra prediksjon av </w:t>
-      </w:r>
-      <w:proofErr w:type="spellStart"/>
-      <w:r>
-        <w:t>offhire</w:t>
-      </w:r>
-      <w:proofErr w:type="spellEnd"/>
-      <w:r>
-        <w:t xml:space="preserve"> hendelser sammenlignet med tradisjonelle statistiske modeller. En slik analyse kan gi både teoretisk bidrag til forskningen på prediktiv logistikk og praktiske implikasjoner for reder</w:t>
-      </w:r>
-      <w:r>
-        <w:t xml:space="preserve">ienes beslutningsprosesser. </w:t>
-      </w:r>
-    </w:p>
-    <w:p/>
-    <w:p>
-      <w:r>
-        <w:t>Introduksjonen bør ikke være for lang, mellom 1-4 sider, helst</w:t>
-      </w:r>
-      <w:r>
-        <w:t xml:space="preserve"> kun</w:t>
-      </w:r>
-      <w:r>
-        <w:t xml:space="preserve"> 1-2.</w:t>
-      </w:r>
-      <w:r>
-        <w:t xml:space="preserve"> For mye skrift her kan være et tegn på at man sliter med å være presis.</w:t>
-      </w:r>
-      <w:r>
-        <w:t xml:space="preserve"> Ta utgangspunkt i et generelt tema og deretter beskriv den aktuelle problemstillingen.</w:t>
-      </w:r>
-    </w:p>
-    <w:p/>
-    <w:p>
-      <w:r>
-        <w:t>Svar på følgende spørsmål:</w:t>
-      </w:r>
-    </w:p>
-    <w:p>
-      <w:pPr>
-        <w:pStyle w:val="Listeavsnitt"/>
-        <w:numPr>
-          <w:ilvl w:val="0"/>
-          <w:numId w:val="25"/>
-        </w:numPr>
-      </w:pPr>
-      <w:r>
-        <w:t>Hv</w:t>
-      </w:r>
-      <w:r>
-        <w:t>ilket tema</w:t>
-      </w:r>
-      <w:r>
-        <w:t xml:space="preserve"> handler oppgaven om?</w:t>
-      </w:r>
-    </w:p>
-    <w:p>
-      <w:pPr>
-        <w:pStyle w:val="Listeavsnitt"/>
-        <w:numPr>
-          <w:ilvl w:val="0"/>
-          <w:numId w:val="25"/>
-        </w:numPr>
-      </w:pPr>
-      <w:r>
-        <w:t>Hvorfor er tema aktuelt?</w:t>
-      </w:r>
-    </w:p>
-    <w:p>
-      <w:pPr>
-        <w:pStyle w:val="Listeavsnitt"/>
-        <w:numPr>
-          <w:ilvl w:val="0"/>
-          <w:numId w:val="25"/>
-        </w:numPr>
-      </w:pPr>
-      <w:r>
-        <w:t>Hva har blitt gjort tidligere</w:t>
-      </w:r>
-      <w:r>
-        <w:t xml:space="preserve"> </w:t>
-      </w:r>
-      <w:r>
-        <w:t>(</w:t>
-      </w:r>
-      <w:r>
-        <w:t>de mest vesentlige referansene</w:t>
-      </w:r>
-      <w:r>
-        <w:t>)</w:t>
-      </w:r>
-      <w:r>
-        <w:t>?</w:t>
-      </w:r>
-    </w:p>
-    <w:p>
-      <w:pPr>
-        <w:pStyle w:val="Listeavsnitt"/>
-        <w:numPr>
-          <w:ilvl w:val="0"/>
-          <w:numId w:val="25"/>
-        </w:numPr>
-      </w:pPr>
-      <w:r>
-        <w:t xml:space="preserve">Hva </w:t>
-      </w:r>
-      <w:r>
-        <w:t xml:space="preserve">er rapportens problemstilling (eget </w:t>
-      </w:r>
-      <w:r>
-        <w:t>underavsnitt</w:t>
-      </w:r>
-      <w:r>
-        <w:t>)</w:t>
-      </w:r>
-      <w:r>
-        <w:t>?</w:t>
-      </w:r>
-    </w:p>
-    <w:p>
-      <w:pPr>
-        <w:pStyle w:val="Listeavsnitt"/>
-        <w:numPr>
-          <w:ilvl w:val="0"/>
-          <w:numId w:val="25"/>
-        </w:numPr>
-      </w:pPr>
-      <w:r>
-        <w:t xml:space="preserve">Hvilke avgrensinger </w:t>
-      </w:r>
-      <w:r>
-        <w:t>gjøres</w:t>
-      </w:r>
-      <w:r>
-        <w:t xml:space="preserve"> (eget underavsnitt)?</w:t>
-      </w:r>
-    </w:p>
-    <w:p/>
-    <w:p>
-      <w:r>
-        <w:t>Viktige momenter:</w:t>
-      </w:r>
-    </w:p>
-    <w:p>
-      <w:pPr>
-        <w:pStyle w:val="Listeavsnitt"/>
-        <w:numPr>
-          <w:ilvl w:val="0"/>
-          <w:numId w:val="26"/>
-        </w:numPr>
-      </w:pPr>
-      <w:r>
-        <w:t xml:space="preserve">Skap </w:t>
-      </w:r>
-      <w:r>
-        <w:t>nysgjerrighet</w:t>
-      </w:r>
-      <w:r>
-        <w:t xml:space="preserve"> slik at leseren </w:t>
-      </w:r>
-      <w:r>
-        <w:t>ønsker å lese videre</w:t>
-      </w:r>
-      <w:r>
-        <w:t>. Kunsten er ofte å aktualisere temaet</w:t>
-      </w:r>
-      <w:r>
-        <w:t xml:space="preserve"> for deretter o peke på konsekvenser som resultatet kan gi. Men unngå å brodere ut hvordan </w:t>
-      </w:r>
-      <w:r>
-        <w:t>resultatet oppnås</w:t>
-      </w:r>
-      <w:r>
-        <w:t xml:space="preserve"> – for </w:t>
-      </w:r>
-      <w:r>
-        <w:t>da</w:t>
-      </w:r>
-      <w:r>
-        <w:t xml:space="preserve"> må leseren </w:t>
-      </w:r>
-      <w:r>
-        <w:t>lese</w:t>
-      </w:r>
-      <w:r>
-        <w:t xml:space="preserve"> videre.</w:t>
-      </w:r>
-      <w:r>
-        <w:t xml:space="preserve"> </w:t>
-      </w:r>
-    </w:p>
-    <w:p>
-      <w:pPr>
-        <w:pStyle w:val="Listeavsnitt"/>
-        <w:numPr>
-          <w:ilvl w:val="0"/>
-          <w:numId w:val="26"/>
-        </w:numPr>
-      </w:pPr>
-      <w:r>
-        <w:t xml:space="preserve">Prøv å </w:t>
-      </w:r>
-      <w:r>
-        <w:t>gi leseren innblikk i strukturen</w:t>
-      </w:r>
-      <w:r>
-        <w:t xml:space="preserve"> til rapporten gjennom </w:t>
-      </w:r>
-      <w:r>
-        <w:t>hele introduksjonen</w:t>
-      </w:r>
-      <w:r>
-        <w:t>.</w:t>
-      </w:r>
-    </w:p>
-    <w:p>
-      <w:pPr>
-        <w:pStyle w:val="Listeavsnitt"/>
-        <w:numPr>
-          <w:ilvl w:val="1"/>
-          <w:numId w:val="26"/>
-        </w:numPr>
-      </w:pPr>
-      <w:r>
-        <w:t>«</w:t>
-      </w:r>
-      <w:r>
-        <w:t>Lakseprisens vola</w:t>
-      </w:r>
-      <w:r>
-        <w:t>ti</w:t>
-      </w:r>
-      <w:r>
-        <w:t xml:space="preserve">litet </w:t>
-      </w:r>
-      <w:r>
-        <w:t xml:space="preserve">påvirker svært mange aktører </w:t>
-      </w:r>
-      <w:proofErr w:type="gramStart"/>
-      <w:r>
-        <w:t>som…</w:t>
-      </w:r>
-      <w:proofErr w:type="gramEnd"/>
-      <w:r>
-        <w:t>»</w:t>
-      </w:r>
-    </w:p>
-    <w:p>
-      <w:pPr>
-        <w:pStyle w:val="Listeavsnitt"/>
-        <w:numPr>
-          <w:ilvl w:val="1"/>
-          <w:numId w:val="26"/>
-        </w:numPr>
-      </w:pPr>
-      <w:r>
-        <w:t>«</w:t>
-      </w:r>
-      <w:proofErr w:type="spellStart"/>
-      <w:r>
-        <w:t>Ref</w:t>
-      </w:r>
-      <w:proofErr w:type="spellEnd"/>
-      <w:r>
-        <w:t xml:space="preserve"> 1 har vist at lakseprisen er avhengig </w:t>
-      </w:r>
-      <w:proofErr w:type="gramStart"/>
-      <w:r>
-        <w:t>av…</w:t>
-      </w:r>
-      <w:proofErr w:type="gramEnd"/>
-      <w:r>
-        <w:t>»</w:t>
-      </w:r>
-    </w:p>
-    <w:p>
-      <w:pPr>
-        <w:pStyle w:val="Listeavsnitt"/>
-        <w:numPr>
-          <w:ilvl w:val="1"/>
-          <w:numId w:val="26"/>
-        </w:numPr>
-      </w:pPr>
-      <w:r>
-        <w:t xml:space="preserve">«Derimot argumenter </w:t>
-      </w:r>
-      <w:proofErr w:type="spellStart"/>
-      <w:r>
-        <w:t>Ref</w:t>
-      </w:r>
-      <w:proofErr w:type="spellEnd"/>
-      <w:r>
-        <w:t xml:space="preserve"> 2 at </w:t>
-      </w:r>
-      <w:r>
-        <w:t>volatiliteten også påvirkes av»</w:t>
-      </w:r>
-    </w:p>
-    <w:p>
-      <w:pPr>
-        <w:pStyle w:val="Listeavsnitt"/>
-        <w:numPr>
-          <w:ilvl w:val="1"/>
-          <w:numId w:val="26"/>
-        </w:numPr>
-      </w:pPr>
-      <w:r>
-        <w:t>«</w:t>
-      </w:r>
-      <w:r>
-        <w:t>L</w:t>
-      </w:r>
-      <w:r>
-        <w:t>itteraturstudiet vårt viser at</w:t>
-      </w:r>
-      <w:r>
-        <w:t xml:space="preserve"> ingen </w:t>
-      </w:r>
-      <w:r>
-        <w:t xml:space="preserve">har </w:t>
-      </w:r>
-      <w:r>
-        <w:t>inkludert</w:t>
-      </w:r>
-      <w:r>
-        <w:t xml:space="preserve"> </w:t>
-      </w:r>
-      <w:r>
-        <w:t>faktorer som</w:t>
-      </w:r>
-      <w:r>
-        <w:t xml:space="preserve"> …»</w:t>
-      </w:r>
-    </w:p>
-    <w:p>
-      <w:pPr>
-        <w:pStyle w:val="Listeavsnitt"/>
-        <w:numPr>
-          <w:ilvl w:val="1"/>
-          <w:numId w:val="26"/>
-        </w:numPr>
-      </w:pPr>
-      <w:r>
-        <w:t>«</w:t>
-      </w:r>
-      <w:r>
-        <w:t xml:space="preserve">For </w:t>
-      </w:r>
-      <w:proofErr w:type="spellStart"/>
-      <w:r>
-        <w:t>Maritech</w:t>
-      </w:r>
-      <w:proofErr w:type="spellEnd"/>
-      <w:r>
-        <w:t xml:space="preserve"> skaper volatiliteten </w:t>
-      </w:r>
-      <w:r>
-        <w:t xml:space="preserve">utfordringer for kundene </w:t>
-      </w:r>
-      <w:proofErr w:type="gramStart"/>
-      <w:r>
-        <w:t>fordi…</w:t>
-      </w:r>
-      <w:proofErr w:type="gramEnd"/>
-      <w:r>
-        <w:t>»</w:t>
-      </w:r>
-    </w:p>
-    <w:p>
-      <w:pPr>
-        <w:pStyle w:val="Listeavsnitt"/>
-        <w:numPr>
-          <w:ilvl w:val="1"/>
-          <w:numId w:val="26"/>
-        </w:numPr>
-      </w:pPr>
-      <w:r>
-        <w:t>«Med bedre</w:t>
-      </w:r>
-      <w:r>
-        <w:t xml:space="preserve"> modeller kan </w:t>
-      </w:r>
-      <w:proofErr w:type="spellStart"/>
-      <w:r>
-        <w:t>Maritech</w:t>
-      </w:r>
-      <w:proofErr w:type="spellEnd"/>
-      <w:r>
-        <w:t xml:space="preserve"> gi fordel til sine kunder</w:t>
-      </w:r>
-      <w:r>
-        <w:t xml:space="preserve"> ved </w:t>
-      </w:r>
-      <w:proofErr w:type="gramStart"/>
-      <w:r>
-        <w:t>at</w:t>
-      </w:r>
-      <w:r>
-        <w:t>…</w:t>
-      </w:r>
-      <w:proofErr w:type="gramEnd"/>
-      <w:r>
-        <w:t>»</w:t>
-      </w:r>
-      <w:r>
-        <w:t xml:space="preserve"> </w:t>
-      </w:r>
-    </w:p>
-    <w:p>
-      <w:pPr>
-        <w:pStyle w:val="Listeavsnitt"/>
-        <w:numPr>
-          <w:ilvl w:val="1"/>
-          <w:numId w:val="26"/>
-        </w:numPr>
-      </w:pPr>
-      <w:r>
-        <w:t>«</w:t>
-      </w:r>
-      <w:r>
-        <w:t xml:space="preserve">Vi </w:t>
-      </w:r>
-      <w:r>
-        <w:t>har brukt</w:t>
-      </w:r>
-      <w:r>
-        <w:t xml:space="preserve"> </w:t>
-      </w:r>
-      <w:r>
-        <w:t>bedriftens salgsdata for å kartlegge</w:t>
-      </w:r>
-      <w:r>
-        <w:t xml:space="preserve"> </w:t>
-      </w:r>
-      <w:r>
-        <w:t xml:space="preserve">hvilke faktorer </w:t>
-      </w:r>
-      <w:proofErr w:type="gramStart"/>
-      <w:r>
-        <w:t>som</w:t>
-      </w:r>
-      <w:r>
-        <w:t>…</w:t>
-      </w:r>
-      <w:proofErr w:type="gramEnd"/>
-      <w:r>
-        <w:t>»</w:t>
-      </w:r>
-    </w:p>
-    <w:p>
-      <w:pPr>
-        <w:pStyle w:val="Listeavsnitt"/>
-        <w:numPr>
-          <w:ilvl w:val="1"/>
-          <w:numId w:val="26"/>
-        </w:numPr>
-      </w:pPr>
-      <w:r>
-        <w:t>«Basert på</w:t>
-      </w:r>
-      <w:r>
-        <w:t xml:space="preserve"> statistisk</w:t>
-      </w:r>
-      <w:r>
-        <w:t xml:space="preserve"> </w:t>
-      </w:r>
-      <w:r>
-        <w:t>regresjonste</w:t>
-      </w:r>
-      <w:r>
-        <w:t>ori</w:t>
-      </w:r>
-      <w:r>
-        <w:t xml:space="preserve"> </w:t>
-      </w:r>
-      <w:r>
-        <w:t xml:space="preserve">har vi </w:t>
-      </w:r>
-      <w:r>
-        <w:t>beskrev</w:t>
-      </w:r>
-      <w:r>
-        <w:t>et</w:t>
-      </w:r>
-      <w:r>
-        <w:t xml:space="preserve"> en</w:t>
-      </w:r>
-      <w:r>
-        <w:t xml:space="preserve"> ny</w:t>
-      </w:r>
-      <w:r>
-        <w:t xml:space="preserve"> modell </w:t>
-      </w:r>
-      <w:proofErr w:type="gramStart"/>
-      <w:r>
-        <w:t>som…</w:t>
-      </w:r>
-      <w:proofErr w:type="gramEnd"/>
-      <w:r>
-        <w:t>»</w:t>
-      </w:r>
-    </w:p>
-    <w:p>
-      <w:pPr>
-        <w:pStyle w:val="Listeavsnitt"/>
-        <w:numPr>
-          <w:ilvl w:val="1"/>
-          <w:numId w:val="26"/>
-        </w:numPr>
-      </w:pPr>
-      <w:r>
-        <w:t>«</w:t>
-      </w:r>
-      <w:r>
-        <w:t>I a</w:t>
-      </w:r>
-      <w:r>
-        <w:t xml:space="preserve">nalysen </w:t>
-      </w:r>
-      <w:r>
-        <w:t xml:space="preserve">har vi indentifisert interessante funn som </w:t>
-      </w:r>
-      <w:proofErr w:type="spellStart"/>
-      <w:r>
-        <w:t>bl.a</w:t>
-      </w:r>
-      <w:proofErr w:type="spellEnd"/>
-      <w:r>
-        <w:t>…»</w:t>
-      </w:r>
-    </w:p>
-    <w:p>
-      <w:pPr>
-        <w:pStyle w:val="Listeavsnitt"/>
-        <w:numPr>
-          <w:ilvl w:val="1"/>
-          <w:numId w:val="26"/>
-        </w:numPr>
-      </w:pPr>
-      <w:r>
-        <w:t xml:space="preserve">«Konklusjonen er derfor </w:t>
-      </w:r>
-      <w:proofErr w:type="gramStart"/>
-      <w:r>
-        <w:t>at</w:t>
-      </w:r>
-      <w:r>
-        <w:t>…</w:t>
-      </w:r>
-      <w:proofErr w:type="gramEnd"/>
-      <w:r>
-        <w:t>»</w:t>
-      </w:r>
-    </w:p>
-    <w:p>
-      <w:pPr>
-        <w:pStyle w:val="Listeavsnitt"/>
-        <w:numPr>
-          <w:ilvl w:val="0"/>
-          <w:numId w:val="26"/>
-        </w:numPr>
-      </w:pPr>
-      <w:r>
-        <w:t>Det er lurt å</w:t>
-      </w:r>
-      <w:r>
-        <w:t xml:space="preserve"> henvise tilbake til introduksjonen</w:t>
-      </w:r>
-      <w:r>
-        <w:t xml:space="preserve"> </w:t>
-      </w:r>
-      <w:r>
+        <w:t>Problemstilling</w:t>
+      </w:r>
+      <w:bookmarkEnd w:id="17"/>
+    </w:p>
+    <w:p>
+      <w:r>
+        <w:t xml:space="preserve">Formålet med denne studien er å undersøke modellvalg i prognostisering av operasjonell nedetid i offshore næringen. På bakgrunn av behovet for mer presis beslutningsstøtte i et ustabilt marked så blir det følgende problemstilling: </w:t>
+      </w:r>
+    </w:p>
+    <w:p>
+      <w:pPr>
         <w:rPr>
           <w:i/>
           <w:iCs/>
         </w:rPr>
-        <w:t>indirekte</w:t>
-      </w:r>
-      <w:r>
-        <w:t xml:space="preserve"> ved å f.eks. bruke setninger som </w:t>
-      </w:r>
-      <w:r>
-        <w:t xml:space="preserve">gjentar litt det som ble sagt i introduksjonen. På den måten skapes det en </w:t>
-      </w:r>
-      <w:r>
-        <w:t xml:space="preserve">rød </w:t>
-      </w:r>
-      <w:r>
-        <w:lastRenderedPageBreak/>
-        <w:t>tr</w:t>
-      </w:r>
-      <w:r>
-        <w:t>å</w:t>
-      </w:r>
-      <w:r>
-        <w:t>d</w:t>
-      </w:r>
-      <w:r>
-        <w:t xml:space="preserve"> hos leseren </w:t>
-      </w:r>
-      <w:r>
-        <w:t xml:space="preserve">gjennom hele rapporten </w:t>
-      </w:r>
-      <w:r>
-        <w:t xml:space="preserve">hvor hen minnes på hvorfor </w:t>
-      </w:r>
-      <w:r>
-        <w:t>rapporten er interessant</w:t>
-      </w:r>
-      <w:r>
-        <w:t>.</w:t>
-      </w:r>
-    </w:p>
-    <w:p>
-      <w:pPr>
-        <w:pStyle w:val="Overskrift2"/>
-      </w:pPr>
-      <w:bookmarkStart w:id="17" w:name="_Toc222057404"/>
-      <w:r>
-        <w:t>Problemstilling</w:t>
-      </w:r>
-      <w:bookmarkEnd w:id="17"/>
-    </w:p>
-    <w:p>
-      <w:r>
-        <w:t>Problemstillingen din er avgjørende for et godt resultat. Dette skal ikke være et «hva»- eller «hvilket»-spørsmål.</w:t>
-      </w:r>
-    </w:p>
-    <w:p>
-      <w:pPr>
-        <w:rPr>
-          <w:lang w:eastAsia="nb-NO" w:bidi="ar-SA"/>
-        </w:rPr>
-      </w:pPr>
-    </w:p>
-    <w:p>
-      <w:r>
-        <w:t>Sørg for at du har en «hvordan»- eller «hvorfor»-spørsmål, noe som vil gjøre problemstillingen din mye mer omfattende.</w:t>
-      </w:r>
-    </w:p>
-    <w:p/>
-    <w:p>
-      <w:r>
-        <w:t>En god problemstilling danner grunnlaget for hele oppgaven din, så her er det verdt å tenke seg nøye om.</w:t>
-      </w:r>
-    </w:p>
-    <w:p/>
-    <w:p>
-      <w:r>
-        <w:t xml:space="preserve">Kan godt gjenta noe av det som ble sagt i innledningen. </w:t>
-      </w:r>
-    </w:p>
-    <w:p/>
-    <w:p>
-      <w:r>
-        <w:t>Her er det viktig at du</w:t>
-      </w:r>
-    </w:p>
-    <w:p>
-      <w:pPr>
-        <w:pStyle w:val="Listeavsnitt"/>
-        <w:numPr>
-          <w:ilvl w:val="0"/>
-          <w:numId w:val="27"/>
-        </w:numPr>
-      </w:pPr>
-      <w:r>
-        <w:t>er så spesifikk som mulig</w:t>
-      </w:r>
-    </w:p>
-    <w:p>
-      <w:pPr>
-        <w:pStyle w:val="Listeavsnitt"/>
-        <w:numPr>
-          <w:ilvl w:val="0"/>
-          <w:numId w:val="27"/>
-        </w:numPr>
-      </w:pPr>
-      <w:r>
-        <w:t>er svært nøye med formuleringene</w:t>
-      </w:r>
-    </w:p>
-    <w:p>
-      <w:pPr>
-        <w:pStyle w:val="Listeavsnitt"/>
-        <w:numPr>
-          <w:ilvl w:val="0"/>
-          <w:numId w:val="27"/>
-        </w:numPr>
-      </w:pPr>
-      <w:r>
-        <w:t>ikke skriver noe du ikke svarer på (</w:t>
-      </w:r>
-      <w:proofErr w:type="spellStart"/>
-      <w:r>
-        <w:rPr>
-          <w:color w:val="ED0000"/>
-        </w:rPr>
-        <w:t>dangerzone</w:t>
-      </w:r>
-      <w:proofErr w:type="spellEnd"/>
-      <w:r>
-        <w:t>)</w:t>
-      </w:r>
-    </w:p>
-    <w:p>
-      <w:pPr>
-        <w:pStyle w:val="Listeavsnitt"/>
-        <w:numPr>
-          <w:ilvl w:val="0"/>
-          <w:numId w:val="27"/>
-        </w:numPr>
-      </w:pPr>
-      <w:r>
-        <w:t xml:space="preserve">ikke svarer på noe </w:t>
-      </w:r>
+      </w:pPr>
       <w:r>
         <w:rPr>
           <w:i/>
           <w:iCs/>
         </w:rPr>
-        <w:t>mer</w:t>
-      </w:r>
-      <w:r>
-        <w:t xml:space="preserve"> enn det som står i problemstillingen (da burde det enten vært tatt ut eller vært inkludert i problemstillingen (</w:t>
+        <w:t xml:space="preserve">Hvordan påvirker valg av prognosemodell prediksjonsnøyaktigheten for </w:t>
       </w:r>
       <w:proofErr w:type="spellStart"/>
-      <w:r>
-        <w:rPr>
-          <w:color w:val="ED0000"/>
-        </w:rPr>
-        <w:t>dangerzone</w:t>
-      </w:r>
-      <w:proofErr w:type="spellEnd"/>
-      <w:r>
-        <w:t xml:space="preserve">) </w:t>
-      </w:r>
-    </w:p>
-    <w:p>
-      <w:pPr>
-        <w:pStyle w:val="Overskrift2"/>
-      </w:pPr>
-      <w:bookmarkStart w:id="18" w:name="_Toc222057405"/>
-      <w:r>
-        <w:t>Delproblemer (valgfri)</w:t>
-      </w:r>
-      <w:bookmarkEnd w:id="18"/>
-    </w:p>
-    <w:p>
-      <w:r>
-        <w:t>Du kan om nødvendig dele opp problemstillingen din i flere delproblemer, dersom problemstillingen er komplisert eller omfattende. Det er da viktig at disse delproblemene blir fremstilt i en logisk rekkefølge som gir mening for hovedproblemstillingen. Vær også tydelig til leseren hvilket delproblem du svarer på til enhver tid.</w:t>
-      </w:r>
-    </w:p>
-    <w:p>
-      <w:pPr>
-        <w:pStyle w:val="Overskrift2"/>
-      </w:pPr>
-      <w:bookmarkStart w:id="19" w:name="_Toc222057406"/>
-      <w:r>
-        <w:t>Avgrensinger</w:t>
-      </w:r>
-      <w:bookmarkEnd w:id="19"/>
-    </w:p>
-    <w:p>
-      <w:r>
-        <w:t xml:space="preserve">Avgrensing er en svært viktig måte å </w:t>
-      </w:r>
       <w:r>
         <w:rPr>
           <w:i/>
           <w:iCs/>
         </w:rPr>
-        <w:t>snevre inn</w:t>
-      </w:r>
-      <w:r>
-        <w:t xml:space="preserve"> en problemstilling. Her forklarer du hvorfor du ikke har tatt med det og det. Pass på at du ikke avgrenser noe uten å forklare hvorfor, og husk aldri skriv at du ikke har nok tid e.l. det er et stort tegn på en for vidt formulert problemstilling.</w:t>
-      </w:r>
-    </w:p>
-    <w:p>
-      <w:pPr>
-        <w:pStyle w:val="Listeavsnitt"/>
-        <w:numPr>
-          <w:ilvl w:val="0"/>
-          <w:numId w:val="28"/>
-        </w:numPr>
-      </w:pPr>
-      <w:r>
-        <w:lastRenderedPageBreak/>
-        <w:t xml:space="preserve">«Vi avgrenser oppgaven til kun ett produkt </w:t>
-      </w:r>
-      <w:proofErr w:type="gramStart"/>
-      <w:r>
-        <w:t>siden…</w:t>
-      </w:r>
-      <w:proofErr w:type="gramEnd"/>
-      <w:r>
-        <w:t>»</w:t>
-      </w:r>
-    </w:p>
-    <w:p>
-      <w:pPr>
-        <w:pStyle w:val="Listeavsnitt"/>
-        <w:numPr>
-          <w:ilvl w:val="0"/>
-          <w:numId w:val="28"/>
-        </w:numPr>
-      </w:pPr>
-      <w:r>
-        <w:t xml:space="preserve">«Vi analyserer 80% av kundene da de resterende </w:t>
-      </w:r>
-      <w:proofErr w:type="gramStart"/>
-      <w:r>
-        <w:t>ikke…</w:t>
-      </w:r>
-      <w:proofErr w:type="gramEnd"/>
-      <w:r>
-        <w:t>»</w:t>
-      </w:r>
-    </w:p>
-    <w:p>
-      <w:pPr>
-        <w:pStyle w:val="Listeavsnitt"/>
-        <w:numPr>
-          <w:ilvl w:val="0"/>
-          <w:numId w:val="28"/>
-        </w:numPr>
-      </w:pPr>
-      <w:r>
-        <w:t xml:space="preserve">«Oppgaven omfatter kun Norge, da det utenlandske markedet </w:t>
-      </w:r>
-      <w:proofErr w:type="gramStart"/>
-      <w:r>
-        <w:t>ikke…</w:t>
-      </w:r>
-      <w:proofErr w:type="gramEnd"/>
-      <w:r>
-        <w:t>»</w:t>
-      </w:r>
-    </w:p>
-    <w:p>
-      <w:pPr>
-        <w:pStyle w:val="Overskrift2"/>
-      </w:pPr>
-      <w:bookmarkStart w:id="20" w:name="_Toc222057407"/>
-      <w:r>
-        <w:t>Antagelser</w:t>
-      </w:r>
-      <w:bookmarkEnd w:id="20"/>
-    </w:p>
-    <w:p>
-      <w:r>
-        <w:t xml:space="preserve">Antagelser er en måte å </w:t>
-      </w:r>
+        <w:t>offhire</w:t>
+      </w:r>
+      <w:proofErr w:type="spellEnd"/>
       <w:r>
         <w:rPr>
           <w:i/>
           <w:iCs/>
         </w:rPr>
-        <w:t>presisere</w:t>
-      </w:r>
-      <w:r>
-        <w:t xml:space="preserve"> en problemstilling på. En antagelser er ikke det samme som avgrensing. En avgrensing snevrer inn omfanget, mens en antagelse presiserer situasjonen som analyseres. Man må forklare hvorfor man har tatt antagelsen, og hvilke konsekvenser den får på aktualiteten til analysen.</w:t>
-      </w:r>
-    </w:p>
-    <w:p>
-      <w:pPr>
-        <w:pStyle w:val="Listeavsnitt"/>
-        <w:numPr>
-          <w:ilvl w:val="0"/>
-          <w:numId w:val="29"/>
-        </w:numPr>
-      </w:pPr>
-      <w:r>
-        <w:t xml:space="preserve">«Vi antar at antall innkommende ordrer er Poissonfordelt </w:t>
+        <w:t xml:space="preserve">- hendelser for </w:t>
+      </w:r>
+      <w:proofErr w:type="spellStart"/>
+      <w:r>
+        <w:rPr>
+          <w:i/>
+          <w:iCs/>
+        </w:rPr>
+        <w:t>PSVer</w:t>
+      </w:r>
+      <w:proofErr w:type="spellEnd"/>
+      <w:r>
+        <w:rPr>
+          <w:i/>
+          <w:iCs/>
+        </w:rPr>
+        <w:t>, når maskinlæringsmodeller sammenlignes med tradisjonelle tidsseriemodeller?</w:t>
+      </w:r>
+    </w:p>
+    <w:p>
+      <w:pPr>
+        <w:rPr>
+          <w:i/>
+          <w:iCs/>
+        </w:rPr>
+      </w:pPr>
+    </w:p>
+    <w:p>
+      <w:pPr>
+        <w:rPr>
+          <w:i/>
+          <w:iCs/>
+        </w:rPr>
+      </w:pPr>
+      <w:r>
+        <w:rPr>
+          <w:i/>
+          <w:iCs/>
+        </w:rPr>
+        <w:t xml:space="preserve">Hvordan kan maskinlæringsmodeller forbedre prediksjonen av </w:t>
+      </w:r>
+      <w:proofErr w:type="spellStart"/>
+      <w:r>
+        <w:rPr>
+          <w:i/>
+          <w:iCs/>
+        </w:rPr>
+        <w:t>offhire</w:t>
+      </w:r>
+      <w:proofErr w:type="spellEnd"/>
+      <w:r>
+        <w:rPr>
+          <w:i/>
+          <w:iCs/>
+        </w:rPr>
+        <w:t xml:space="preserve">- hendelser innenfor PSV segmentet sammenlignet med tradisjonelle tidsseriemodeller? </w:t>
+      </w:r>
+    </w:p>
+    <w:p>
+      <w:pPr>
+        <w:rPr>
+          <w:i/>
+          <w:iCs/>
+        </w:rPr>
+      </w:pPr>
+    </w:p>
+    <w:p>
+      <w:pPr>
+        <w:pStyle w:val="Overskrift2"/>
+      </w:pPr>
+      <w:bookmarkStart w:id="18" w:name="_Toc222057406"/>
+      <w:r>
+        <w:t>Avgrensinger</w:t>
+      </w:r>
+      <w:bookmarkEnd w:id="18"/>
+    </w:p>
+    <w:p>
+      <w:r>
+        <w:t xml:space="preserve">Denne studien blir avgrenset til plattform forsyningsfartøy (PSV) innen forsyningssegmentet. Andre fartøystyper som ankerhåndterer og konstruksjonsfartøy vil ikke bli inkludert. Dette gjøres for å sikre sammenlignbarhet i operasjonelle forhold og </w:t>
+      </w:r>
+      <w:r>
+        <w:t>kontrakts struktur</w:t>
+      </w:r>
+      <w:r>
+        <w:t xml:space="preserve">, ettersom ulike fartøystyper operer under forskjellige tekniske og markedsmessige rammebetingelser. </w:t>
+      </w:r>
+    </w:p>
+    <w:p/>
+    <w:p>
+      <w:r>
+        <w:t xml:space="preserve">Videre så avgrenses analysen til prediksjon av </w:t>
+      </w:r>
+      <w:proofErr w:type="spellStart"/>
+      <w:r>
+        <w:t>offhire</w:t>
+      </w:r>
+      <w:proofErr w:type="spellEnd"/>
+      <w:r>
+        <w:t xml:space="preserve">- hendelser definert som perioder hvor fartøy ikke </w:t>
       </w:r>
       <w:proofErr w:type="gramStart"/>
       <w:r>
-        <w:t>fordi…dette</w:t>
+        <w:t>generer</w:t>
       </w:r>
       <w:proofErr w:type="gramEnd"/>
       <w:r>
-        <w:t xml:space="preserve"> gjør </w:t>
-      </w:r>
-      <w:proofErr w:type="gramStart"/>
-      <w:r>
-        <w:t>at…</w:t>
-      </w:r>
-      <w:proofErr w:type="gramEnd"/>
-      <w:r>
-        <w:t>»</w:t>
-      </w:r>
-    </w:p>
-    <w:p>
-      <w:pPr>
-        <w:pStyle w:val="Listeavsnitt"/>
-        <w:numPr>
-          <w:ilvl w:val="0"/>
-          <w:numId w:val="29"/>
-        </w:numPr>
-      </w:pPr>
-      <w:r>
-        <w:t xml:space="preserve">«Vi antar at vi kan se vekk fra effekten av prisene i Sverige </w:t>
-      </w:r>
-      <w:proofErr w:type="gramStart"/>
-      <w:r>
-        <w:t>fordi…dette</w:t>
-      </w:r>
-      <w:proofErr w:type="gramEnd"/>
-      <w:r>
-        <w:t xml:space="preserve"> gjør </w:t>
-      </w:r>
-      <w:proofErr w:type="gramStart"/>
-      <w:r>
-        <w:t>at…</w:t>
-      </w:r>
-      <w:proofErr w:type="gramEnd"/>
-      <w:r>
-        <w:t>»</w:t>
+        <w:t xml:space="preserve"> </w:t>
+      </w:r>
+      <w:r>
+        <w:t>kontrakts inntekter</w:t>
+      </w:r>
+      <w:r>
+        <w:t xml:space="preserve"> som følge av tekniske forhold eller manglende kontrakt. </w:t>
+      </w:r>
+      <w:r>
+        <w:t xml:space="preserve">Det vil heller ikke bli lagt opp mer skille mellom ulike årsaks kategorier innen </w:t>
+      </w:r>
+      <w:proofErr w:type="spellStart"/>
+      <w:r>
+        <w:t>offhire</w:t>
+      </w:r>
+      <w:proofErr w:type="spellEnd"/>
+      <w:r>
+        <w:t xml:space="preserve">, da formålet er å evaluere modellens prediktive ytelse, ikke å analysere årsakssammenhenger. </w:t>
       </w:r>
     </w:p>
     <w:p/>
     <w:p>
+      <w:r>
+        <w:t xml:space="preserve">Analysen baseres på historiske operasjonelle data innen en definert tidsperiode. Eksterne økonomiske faktorer som globale energipriser eller geopolitisk risiko vil bli inkludert i den grad de er reflektert indirekte i datasettet. </w:t>
+      </w:r>
+    </w:p>
+    <w:p/>
+    <w:p>
+      <w:r>
+        <w:t xml:space="preserve">Videre fokuserer studien på sammenligning av modelltyper med hensyn til prediksjonsnøyaktighet. Implementeringskostnader, organisatoriske endringer og teknologisk integrasjon inngår ikke i analysen og faller derfor utenfor formålet. </w:t>
+      </w:r>
+      <w:r>
+        <w:t xml:space="preserve">I tillegg til at modellene som vil bli brukt er avgrenset til kun to av hver kategori, det vil si to tradisjonelle metoder og to KI baserte modeller. </w:t>
+      </w:r>
+    </w:p>
+    <w:p>
+      <w:pPr>
+        <w:pStyle w:val="Overskrift2"/>
+      </w:pPr>
+      <w:bookmarkStart w:id="19" w:name="_Toc222057407"/>
+      <w:r>
+        <w:lastRenderedPageBreak/>
+        <w:t>Antagelse</w:t>
+      </w:r>
+      <w:bookmarkEnd w:id="19"/>
+      <w:r>
+        <w:t>r</w:t>
+      </w:r>
+    </w:p>
+    <w:p>
+      <w:pPr>
+        <w:rPr>
+          <w:b/>
+          <w:bCs/>
+        </w:rPr>
+      </w:pPr>
+      <w:r>
+        <w:rPr>
+          <w:b/>
+          <w:bCs/>
+        </w:rPr>
+        <w:t xml:space="preserve">Stabil definisjon av </w:t>
+      </w:r>
+      <w:proofErr w:type="spellStart"/>
+      <w:r>
+        <w:rPr>
+          <w:b/>
+          <w:bCs/>
+        </w:rPr>
+        <w:t>offhire</w:t>
+      </w:r>
+      <w:proofErr w:type="spellEnd"/>
+    </w:p>
+    <w:p>
+      <w:r>
+        <w:t>Det antas at de</w:t>
+      </w:r>
+      <w:r>
+        <w:t xml:space="preserve">finisjonen av </w:t>
+      </w:r>
+      <w:proofErr w:type="spellStart"/>
+      <w:r>
+        <w:t>offhire</w:t>
+      </w:r>
+      <w:proofErr w:type="spellEnd"/>
+      <w:r>
+        <w:t xml:space="preserve"> er konsistent gjennom hele oppgaven. Dette innebærer at registrering av nedetid ikke har endret kriterier eller rapporteringspraksis over en lengre periode. Antagelsen er nødvendig for å sikre at variasjon i datasettet reflekterer reelle operasjonelle forhold og ikke endringer i registreringsrutiner. Konsekvensen er at eventuelle strukturelle brudd i rapporteringspraksis ikke fanges eksplisitt opp i modellen. </w:t>
+      </w:r>
+    </w:p>
+    <w:p/>
+    <w:p>
+      <w:pPr>
+        <w:rPr>
+          <w:b/>
+          <w:bCs/>
+        </w:rPr>
+      </w:pPr>
+      <w:r>
+        <w:rPr>
+          <w:b/>
+          <w:bCs/>
+        </w:rPr>
+        <w:t>Historiske mønstre inneholder prediktiv informasjon</w:t>
+      </w:r>
+    </w:p>
+    <w:p>
+      <w:r>
+        <w:t xml:space="preserve">Det antas at historiske operasjonelle data inneholder systematiske mønstre som kan benyttes til å predikere fremtidige </w:t>
+      </w:r>
+      <w:proofErr w:type="spellStart"/>
+      <w:r>
+        <w:t>offhire</w:t>
+      </w:r>
+      <w:proofErr w:type="spellEnd"/>
+      <w:r>
+        <w:t>- hendelser</w:t>
+      </w:r>
+      <w:r>
+        <w:t xml:space="preserve">. Denne antagelsen ligger implisitt til grunn for all tidsserie- og maskinlæringsbasert prognostisering. Dersom fremtidige hendelser er fullstendig tilfeldige, vil ingen modell kunne gi systematisk bedre prediksjoner enn tilfeldige estimater. Konsekvensen av antagelsen er at analysen evaluerer modellens evne til å utnytte eksisterende mønstre, men ikke kan forutsi strukturelle brudd som ligger utenfor datagrunnlaget. </w:t>
+      </w:r>
+    </w:p>
+    <w:p>
+      <w:pPr>
+        <w:rPr>
+          <w:b/>
+          <w:bCs/>
+        </w:rPr>
+      </w:pPr>
+    </w:p>
+    <w:p>
+      <w:pPr>
+        <w:rPr>
+          <w:b/>
+          <w:bCs/>
+        </w:rPr>
+      </w:pPr>
+      <w:r>
+        <w:rPr>
+          <w:b/>
+          <w:bCs/>
+        </w:rPr>
+        <w:t>Uavhengighet mellom fartøy</w:t>
+      </w:r>
+    </w:p>
+    <w:p>
+      <w:r>
+        <w:t xml:space="preserve">Datasettet vil inkludere flere fartøy, antas det at observasjoner kan behandles som uavhengige mellom fartøy. </w:t>
+      </w:r>
+      <w:r>
+        <w:t xml:space="preserve">Dette forenkler modelleringen og </w:t>
+      </w:r>
+      <w:proofErr w:type="spellStart"/>
+      <w:r>
+        <w:t>muligjør</w:t>
+      </w:r>
+      <w:proofErr w:type="spellEnd"/>
+      <w:r>
+        <w:t xml:space="preserve"> sammenligning av prediktiv ytelse uten å eksplisitt modellere flåteinteraksjoner. Konsekvensen er at eventuelle systematiske sammenhenger mellom fartøy, eksempelvis felles teknisk design eller kontrakts struktur, ikke modellers eksplisitt. </w:t>
+      </w:r>
+    </w:p>
+    <w:p/>
+    <w:p>
+      <w:pPr>
+        <w:rPr>
+          <w:b/>
+          <w:bCs/>
+        </w:rPr>
+      </w:pPr>
+      <w:r>
+        <w:rPr>
+          <w:b/>
+          <w:bCs/>
+        </w:rPr>
+        <w:t>Markedsusikkerhet reflekteres i historiske data</w:t>
+      </w:r>
+    </w:p>
+    <w:p>
+      <w:r>
+        <w:t xml:space="preserve">Det antas at markedsmessig usikkerhet, herunder svingninger i etterspørsel og rater, indirekte er reflektert i de historiske dataene som inngår i analysen. Studien modellerer ikke økonomiske variable eksplisitt, men forutsetter at effekten av markedsforhold er representert gjennom observasjoner av </w:t>
+      </w:r>
+      <w:proofErr w:type="spellStart"/>
+      <w:r>
+        <w:t>kontraktsstatus</w:t>
+      </w:r>
+      <w:proofErr w:type="spellEnd"/>
+      <w:r>
+        <w:t xml:space="preserve"> og </w:t>
+      </w:r>
+      <w:proofErr w:type="spellStart"/>
+      <w:r>
+        <w:t>offhire</w:t>
+      </w:r>
+      <w:proofErr w:type="spellEnd"/>
+      <w:r>
+        <w:t xml:space="preserve">. Konsekvensen er at modellen evalueres under historisk observerte markedsforhold, men ikke testes mot hypotetiske ekstreme scenarier. </w:t>
+      </w:r>
+    </w:p>
+    <w:p/>
+    <w:p/>
+    <w:p>
+      <w:pPr>
+        <w:rPr>
+          <w:b/>
+          <w:bCs/>
+        </w:rPr>
+      </w:pPr>
+      <w:r>
+        <w:rPr>
+          <w:b/>
+          <w:bCs/>
+        </w:rPr>
+        <w:lastRenderedPageBreak/>
+        <w:t>Prediktiv fremfor kausal analyse</w:t>
+      </w:r>
+    </w:p>
+    <w:p>
+      <w:r>
+        <w:t xml:space="preserve">Det antas at formålet med analysen er prediksjon og ikke kausal forklaring. Modellenes prestasjon vurderes ut fra prediktiv nøyaktighet, uavhengig av om forklaringsvariablene representerer direkte årsakssammenhenger. Denne antagelsen er nødvendig for å kunne sammenligne maskinlæringsmodeller og tradisjonelle tidsseriemodeller på likt grunnlag. Konsekvensen er at studien ikke kan trekke konklusjoner om hvilke faktorer som årsaksmessig påvirker </w:t>
+      </w:r>
+      <w:proofErr w:type="spellStart"/>
+      <w:r>
+        <w:t>offhire</w:t>
+      </w:r>
+      <w:proofErr w:type="spellEnd"/>
+      <w:r>
+        <w:t xml:space="preserve">. </w:t>
+      </w:r>
+    </w:p>
+    <w:p/>
+    <w:p>
       <w:pPr>
         <w:pStyle w:val="Overskrift1"/>
       </w:pPr>
-      <w:bookmarkStart w:id="21" w:name="_Toc222057408"/>
+      <w:bookmarkStart w:id="20" w:name="_Toc222057408"/>
       <w:r>
         <w:t>Litteratur</w:t>
       </w:r>
-      <w:bookmarkEnd w:id="21"/>
+      <w:bookmarkEnd w:id="20"/>
     </w:p>
     <w:p>
       <w:r>
@@ -7931,51 +7535,50 @@
       <w:pPr>
         <w:pStyle w:val="Overskrift1"/>
       </w:pPr>
-      <w:bookmarkStart w:id="22" w:name="_Toc222057409"/>
+      <w:bookmarkStart w:id="21" w:name="_Toc222057409"/>
       <w:r>
         <w:t>Teori</w:t>
       </w:r>
+      <w:bookmarkEnd w:id="21"/>
+    </w:p>
+    <w:p>
+      <w:r>
+        <w:t>Når du skal skrive en bacheloroppgave, er det også viktig å inkludere en teoridel. Her skal du beskrive teoretisk perspektiv, tidligere litteratur som beskriver samme tema og hva forskere eventuelt er uenige om.</w:t>
+      </w:r>
+    </w:p>
+    <w:p>
+      <w:pPr>
+        <w:rPr>
+          <w:lang w:eastAsia="nb-NO" w:bidi="ar-SA"/>
+        </w:rPr>
+      </w:pPr>
+    </w:p>
+    <w:p>
+      <w:r>
+        <w:t>Du kan også nevne hvorvidt tidligere forskning kan ha oversett noen faktorer, og plassere egen problemstilling i lys av tidligere litteratur på fagfeltet. </w:t>
+      </w:r>
+    </w:p>
+    <w:p>
+      <w:r>
+        <w:t>Pass på at du får frem hva problemstillingen din belyser, som ikke tidligere forskning allerede har gjennomgått.</w:t>
+      </w:r>
+    </w:p>
+    <w:p/>
+    <w:p>
+      <w:r>
+        <w:t>Teoridelen din skal rett og slett beskrive grunnlaget for studiet ditt, og danner utgangspunktet for videre metodevalg.</w:t>
+      </w:r>
+    </w:p>
+    <w:p/>
+    <w:p>
+      <w:pPr>
+        <w:pStyle w:val="Overskrift1"/>
+      </w:pPr>
+      <w:bookmarkStart w:id="22" w:name="_Toc222057410"/>
+      <w:r>
+        <w:t>Casebeskrivelse</w:t>
+      </w:r>
       <w:bookmarkEnd w:id="22"/>
-    </w:p>
-    <w:p>
-      <w:r>
-        <w:t>Når du skal skrive en bacheloroppgave, er det også viktig å inkludere en teoridel. Her skal du beskrive teoretisk perspektiv, tidligere litteratur som beskriver samme tema og hva forskere eventuelt er uenige om.</w:t>
-      </w:r>
-    </w:p>
-    <w:p>
-      <w:pPr>
-        <w:rPr>
-          <w:lang w:eastAsia="nb-NO" w:bidi="ar-SA"/>
-        </w:rPr>
-      </w:pPr>
-    </w:p>
-    <w:p>
-      <w:r>
-        <w:lastRenderedPageBreak/>
-        <w:t>Du kan også nevne hvorvidt tidligere forskning kan ha oversett noen faktorer, og plassere egen problemstilling i lys av tidligere litteratur på fagfeltet. </w:t>
-      </w:r>
-    </w:p>
-    <w:p>
-      <w:r>
-        <w:t>Pass på at du får frem hva problemstillingen din belyser, som ikke tidligere forskning allerede har gjennomgått.</w:t>
-      </w:r>
-    </w:p>
-    <w:p/>
-    <w:p>
-      <w:r>
-        <w:t>Teoridelen din skal rett og slett beskrive grunnlaget for studiet ditt, og danner utgangspunktet for videre metodevalg.</w:t>
-      </w:r>
-    </w:p>
-    <w:p/>
-    <w:p>
-      <w:pPr>
-        <w:pStyle w:val="Overskrift1"/>
-      </w:pPr>
-      <w:bookmarkStart w:id="23" w:name="_Toc222057410"/>
-      <w:r>
-        <w:t>Casebeskrivelse</w:t>
-      </w:r>
-      <w:bookmarkEnd w:id="23"/>
     </w:p>
     <w:p>
       <w:r>
@@ -8170,54 +7773,54 @@
       <w:pPr>
         <w:pStyle w:val="Overskrift1"/>
       </w:pPr>
-      <w:bookmarkStart w:id="24" w:name="_Toc222057411"/>
+      <w:bookmarkStart w:id="23" w:name="_Toc222057411"/>
       <w:r>
         <w:t>Metode og data</w:t>
       </w:r>
       <w:r>
         <w:t xml:space="preserve"> (kan splittes i to)</w:t>
       </w:r>
+      <w:bookmarkEnd w:id="23"/>
+    </w:p>
+    <w:p>
+      <w:r>
+        <w:t xml:space="preserve">Litt avhengig av </w:t>
+      </w:r>
+      <w:r>
+        <w:t>omfanget</w:t>
+      </w:r>
+      <w:r>
+        <w:t xml:space="preserve">, kan det være </w:t>
+      </w:r>
+      <w:r>
+        <w:t>lurt å vurdere om du skal splitte kapittelet i to eller ikke.</w:t>
+      </w:r>
+    </w:p>
+    <w:p>
+      <w:pPr>
+        <w:pStyle w:val="Overskrift2"/>
+      </w:pPr>
+      <w:bookmarkStart w:id="24" w:name="_Toc222057412"/>
+      <w:r>
+        <w:t>Metode</w:t>
+      </w:r>
       <w:bookmarkEnd w:id="24"/>
     </w:p>
     <w:p>
       <w:r>
-        <w:t xml:space="preserve">Litt avhengig av </w:t>
-      </w:r>
-      <w:r>
-        <w:t>omfanget</w:t>
-      </w:r>
-      <w:r>
-        <w:t xml:space="preserve">, kan det være </w:t>
-      </w:r>
-      <w:r>
-        <w:t>lurt å vurdere om du skal splitte kapittelet i to eller ikke.</w:t>
-      </w:r>
-    </w:p>
-    <w:p>
-      <w:pPr>
-        <w:pStyle w:val="Overskrift2"/>
-      </w:pPr>
-      <w:bookmarkStart w:id="25" w:name="_Toc222057412"/>
+        <w:t>I oppgavens metodedel skal du beskrive valgt metode. Dette skal beskrives så nøyaktig at andre skal kunne klare å gjenta prosessen. Metodedelen gir leseren mulighet til å vurdere hvorvidt oppgaven kan inneholde feil i fremgangsmåten.</w:t>
+      </w:r>
+    </w:p>
+    <w:p>
+      <w:pPr>
+        <w:rPr>
+          <w:lang w:eastAsia="nb-NO" w:bidi="ar-SA"/>
+        </w:rPr>
+      </w:pPr>
+    </w:p>
+    <w:p>
       <w:r>
         <w:lastRenderedPageBreak/>
-        <w:t>Metode</w:t>
-      </w:r>
-      <w:bookmarkEnd w:id="25"/>
-    </w:p>
-    <w:p>
-      <w:r>
-        <w:t>I oppgavens metodedel skal du beskrive valgt metode. Dette skal beskrives så nøyaktig at andre skal kunne klare å gjenta prosessen. Metodedelen gir leseren mulighet til å vurdere hvorvidt oppgaven kan inneholde feil i fremgangsmåten.</w:t>
-      </w:r>
-    </w:p>
-    <w:p>
-      <w:pPr>
-        <w:rPr>
-          <w:lang w:eastAsia="nb-NO" w:bidi="ar-SA"/>
-        </w:rPr>
-      </w:pPr>
-    </w:p>
-    <w:p>
-      <w:r>
         <w:t>Oppgi paradigme betraktninger, forskningsperspektiv, forskningsdesign, innsamlingsmetode for data, utvalgskriterier, utvalgsmetode, utvalgsstørrelse og analysemetoder.</w:t>
       </w:r>
     </w:p>
@@ -8383,11 +7986,11 @@
       <w:pPr>
         <w:pStyle w:val="Overskrift2"/>
       </w:pPr>
-      <w:bookmarkStart w:id="26" w:name="_Toc222057413"/>
+      <w:bookmarkStart w:id="25" w:name="_Toc222057413"/>
       <w:r>
         <w:t>Data</w:t>
       </w:r>
-      <w:bookmarkEnd w:id="26"/>
+      <w:bookmarkEnd w:id="25"/>
     </w:p>
     <w:p>
       <w:r>
@@ -8505,6 +8108,7 @@
         </w:numPr>
       </w:pPr>
       <w:r>
+        <w:lastRenderedPageBreak/>
         <w:t>Data fra ERP-systemet: Periode-antall observasjoner rå data</w:t>
       </w:r>
       <w:r>
@@ -8526,22 +8130,22 @@
       <w:pPr>
         <w:pStyle w:val="Overskrift1"/>
       </w:pPr>
-      <w:bookmarkStart w:id="27" w:name="_Toc222057414"/>
+      <w:bookmarkStart w:id="26" w:name="_Toc222057414"/>
       <w:r>
         <w:t>Modellering</w:t>
       </w:r>
+      <w:bookmarkEnd w:id="26"/>
+    </w:p>
+    <w:p/>
+    <w:p>
+      <w:pPr>
+        <w:pStyle w:val="Overskrift1"/>
+      </w:pPr>
+      <w:bookmarkStart w:id="27" w:name="_Toc222057415"/>
+      <w:r>
+        <w:t>Analyse</w:t>
+      </w:r>
       <w:bookmarkEnd w:id="27"/>
-    </w:p>
-    <w:p/>
-    <w:p>
-      <w:pPr>
-        <w:pStyle w:val="Overskrift1"/>
-      </w:pPr>
-      <w:bookmarkStart w:id="28" w:name="_Toc222057415"/>
-      <w:r>
-        <w:t>Analyse</w:t>
-      </w:r>
-      <w:bookmarkEnd w:id="28"/>
     </w:p>
     <w:p>
       <w:pPr>
@@ -8661,11 +8265,11 @@
       <w:pPr>
         <w:pStyle w:val="Overskrift1"/>
       </w:pPr>
-      <w:bookmarkStart w:id="29" w:name="_Toc222057416"/>
+      <w:bookmarkStart w:id="28" w:name="_Toc222057416"/>
       <w:r>
         <w:t>Resultat</w:t>
       </w:r>
-      <w:bookmarkEnd w:id="29"/>
+      <w:bookmarkEnd w:id="28"/>
     </w:p>
     <w:p>
       <w:r>
@@ -8698,7 +8302,6 @@
         </w:numPr>
       </w:pPr>
       <w:r>
-        <w:lastRenderedPageBreak/>
         <w:t>Dersom dette er et eget kapittel så skal dere her kun presentere resultatene i form av tabeller og/eller figurer.</w:t>
       </w:r>
     </w:p>
@@ -8754,6 +8357,7 @@
         </w:numPr>
       </w:pPr>
       <w:r>
+        <w:lastRenderedPageBreak/>
         <w:t>Endre forskningsspørsmålet slik at det er samsvar med analysene</w:t>
       </w:r>
     </w:p>
@@ -8796,11 +8400,11 @@
       <w:pPr>
         <w:pStyle w:val="Overskrift1"/>
       </w:pPr>
-      <w:bookmarkStart w:id="30" w:name="_Toc222057417"/>
+      <w:bookmarkStart w:id="29" w:name="_Toc222057417"/>
       <w:r>
         <w:t>Diskusjon</w:t>
       </w:r>
-      <w:bookmarkEnd w:id="30"/>
+      <w:bookmarkEnd w:id="29"/>
     </w:p>
     <w:p>
       <w:pPr>
@@ -8925,7 +8529,6 @@
         </w:numPr>
       </w:pPr>
       <w:r>
-        <w:lastRenderedPageBreak/>
         <w:t xml:space="preserve">Resultatene diskuteres opp mot </w:t>
       </w:r>
       <w:proofErr w:type="gramStart"/>
@@ -9000,6 +8603,7 @@
         </w:numPr>
       </w:pPr>
       <w:r>
+        <w:lastRenderedPageBreak/>
         <w:t>Ta med begrensinger/svakheter i oppgaven</w:t>
       </w:r>
     </w:p>
@@ -9027,11 +8631,11 @@
       <w:pPr>
         <w:pStyle w:val="Overskrift1"/>
       </w:pPr>
-      <w:bookmarkStart w:id="31" w:name="_Toc222057418"/>
+      <w:bookmarkStart w:id="30" w:name="_Toc222057418"/>
       <w:r>
         <w:t>Konklusjon</w:t>
       </w:r>
-      <w:bookmarkEnd w:id="31"/>
+      <w:bookmarkEnd w:id="30"/>
     </w:p>
     <w:p/>
     <w:p>
@@ -9163,21 +8767,21 @@
       <w:pPr>
         <w:pStyle w:val="Overskrift1"/>
       </w:pPr>
-      <w:bookmarkStart w:id="32" w:name="_Toc222057419"/>
+      <w:bookmarkStart w:id="31" w:name="_Toc222057419"/>
       <w:r>
         <w:t>Bibliografi</w:t>
       </w:r>
+      <w:bookmarkEnd w:id="31"/>
+    </w:p>
+    <w:p>
+      <w:pPr>
+        <w:pStyle w:val="Overskrift1"/>
+      </w:pPr>
+      <w:bookmarkStart w:id="32" w:name="_Toc222057420"/>
+      <w:r>
+        <w:t>Vedlegg</w:t>
+      </w:r>
       <w:bookmarkEnd w:id="32"/>
-    </w:p>
-    <w:p>
-      <w:pPr>
-        <w:pStyle w:val="Overskrift1"/>
-      </w:pPr>
-      <w:bookmarkStart w:id="33" w:name="_Toc222057420"/>
-      <w:r>
-        <w:t>Vedlegg</w:t>
-      </w:r>
-      <w:bookmarkEnd w:id="33"/>
     </w:p>
     <w:p/>
     <w:sectPr>
@@ -9768,6 +9372,95 @@
     </w:lvl>
   </w:abstractNum>
   <w:abstractNum w:abstractNumId="12" w15:restartNumberingAfterBreak="0">
+    <w:nsid w:val="04A61654"/>
+    <w:multiLevelType w:val="hybridMultilevel"/>
+    <w:tmpl w:val="F496B300"/>
+    <w:lvl w:ilvl="0" w:tplc="0414000F">
+      <w:start w:val="1"/>
+      <w:numFmt w:val="decimal"/>
+      <w:lvlText w:val="%1."/>
+      <w:lvlJc w:val="left"/>
+      <w:pPr>
+        <w:ind w:left="720" w:hanging="360"/>
+      </w:pPr>
+      <w:rPr>
+        <w:rFonts w:hint="default"/>
+      </w:rPr>
+    </w:lvl>
+    <w:lvl w:ilvl="1" w:tplc="04140019" w:tentative="1">
+      <w:start w:val="1"/>
+      <w:numFmt w:val="lowerLetter"/>
+      <w:lvlText w:val="%2."/>
+      <w:lvlJc w:val="left"/>
+      <w:pPr>
+        <w:ind w:left="1440" w:hanging="360"/>
+      </w:pPr>
+    </w:lvl>
+    <w:lvl w:ilvl="2" w:tplc="0414001B" w:tentative="1">
+      <w:start w:val="1"/>
+      <w:numFmt w:val="lowerRoman"/>
+      <w:lvlText w:val="%3."/>
+      <w:lvlJc w:val="right"/>
+      <w:pPr>
+        <w:ind w:left="2160" w:hanging="180"/>
+      </w:pPr>
+    </w:lvl>
+    <w:lvl w:ilvl="3" w:tplc="0414000F" w:tentative="1">
+      <w:start w:val="1"/>
+      <w:numFmt w:val="decimal"/>
+      <w:lvlText w:val="%4."/>
+      <w:lvlJc w:val="left"/>
+      <w:pPr>
+        <w:ind w:left="2880" w:hanging="360"/>
+      </w:pPr>
+    </w:lvl>
+    <w:lvl w:ilvl="4" w:tplc="04140019" w:tentative="1">
+      <w:start w:val="1"/>
+      <w:numFmt w:val="lowerLetter"/>
+      <w:lvlText w:val="%5."/>
+      <w:lvlJc w:val="left"/>
+      <w:pPr>
+        <w:ind w:left="3600" w:hanging="360"/>
+      </w:pPr>
+    </w:lvl>
+    <w:lvl w:ilvl="5" w:tplc="0414001B" w:tentative="1">
+      <w:start w:val="1"/>
+      <w:numFmt w:val="lowerRoman"/>
+      <w:lvlText w:val="%6."/>
+      <w:lvlJc w:val="right"/>
+      <w:pPr>
+        <w:ind w:left="4320" w:hanging="180"/>
+      </w:pPr>
+    </w:lvl>
+    <w:lvl w:ilvl="6" w:tplc="0414000F" w:tentative="1">
+      <w:start w:val="1"/>
+      <w:numFmt w:val="decimal"/>
+      <w:lvlText w:val="%7."/>
+      <w:lvlJc w:val="left"/>
+      <w:pPr>
+        <w:ind w:left="5040" w:hanging="360"/>
+      </w:pPr>
+    </w:lvl>
+    <w:lvl w:ilvl="7" w:tplc="04140019" w:tentative="1">
+      <w:start w:val="1"/>
+      <w:numFmt w:val="lowerLetter"/>
+      <w:lvlText w:val="%8."/>
+      <w:lvlJc w:val="left"/>
+      <w:pPr>
+        <w:ind w:left="5760" w:hanging="360"/>
+      </w:pPr>
+    </w:lvl>
+    <w:lvl w:ilvl="8" w:tplc="0414001B" w:tentative="1">
+      <w:start w:val="1"/>
+      <w:numFmt w:val="lowerRoman"/>
+      <w:lvlText w:val="%9."/>
+      <w:lvlJc w:val="right"/>
+      <w:pPr>
+        <w:ind w:left="6480" w:hanging="180"/>
+      </w:pPr>
+    </w:lvl>
+  </w:abstractNum>
+  <w:abstractNum w:abstractNumId="13" w15:restartNumberingAfterBreak="0">
     <w:nsid w:val="05036849"/>
     <w:multiLevelType w:val="hybridMultilevel"/>
     <w:tmpl w:val="FFFFFFFF"/>
@@ -9880,7 +9573,7 @@
       </w:rPr>
     </w:lvl>
   </w:abstractNum>
-  <w:abstractNum w:abstractNumId="13" w15:restartNumberingAfterBreak="0">
+  <w:abstractNum w:abstractNumId="14" w15:restartNumberingAfterBreak="0">
     <w:nsid w:val="0A382A5D"/>
     <w:multiLevelType w:val="hybridMultilevel"/>
     <w:tmpl w:val="FFFFFFFF"/>
@@ -9993,7 +9686,7 @@
       </w:rPr>
     </w:lvl>
   </w:abstractNum>
-  <w:abstractNum w:abstractNumId="14" w15:restartNumberingAfterBreak="0">
+  <w:abstractNum w:abstractNumId="15" w15:restartNumberingAfterBreak="0">
     <w:nsid w:val="0B667A6A"/>
     <w:multiLevelType w:val="multilevel"/>
     <w:tmpl w:val="FFFFFFFF"/>
@@ -10106,7 +9799,7 @@
       </w:rPr>
     </w:lvl>
   </w:abstractNum>
-  <w:abstractNum w:abstractNumId="15" w15:restartNumberingAfterBreak="0">
+  <w:abstractNum w:abstractNumId="16" w15:restartNumberingAfterBreak="0">
     <w:nsid w:val="11CB5551"/>
     <w:multiLevelType w:val="hybridMultilevel"/>
     <w:tmpl w:val="FFFFFFFF"/>
@@ -10219,7 +9912,7 @@
       </w:rPr>
     </w:lvl>
   </w:abstractNum>
-  <w:abstractNum w:abstractNumId="16" w15:restartNumberingAfterBreak="0">
+  <w:abstractNum w:abstractNumId="17" w15:restartNumberingAfterBreak="0">
     <w:nsid w:val="24FA3A12"/>
     <w:multiLevelType w:val="hybridMultilevel"/>
     <w:tmpl w:val="FFFFFFFF"/>
@@ -10332,7 +10025,7 @@
       </w:rPr>
     </w:lvl>
   </w:abstractNum>
-  <w:abstractNum w:abstractNumId="17" w15:restartNumberingAfterBreak="0">
+  <w:abstractNum w:abstractNumId="18" w15:restartNumberingAfterBreak="0">
     <w:nsid w:val="2BA16D5C"/>
     <w:multiLevelType w:val="multilevel"/>
     <w:tmpl w:val="FFFFFFFF"/>
@@ -10472,7 +10165,7 @@
       </w:rPr>
     </w:lvl>
   </w:abstractNum>
-  <w:abstractNum w:abstractNumId="18" w15:restartNumberingAfterBreak="0">
+  <w:abstractNum w:abstractNumId="19" w15:restartNumberingAfterBreak="0">
     <w:nsid w:val="2C89474E"/>
     <w:multiLevelType w:val="hybridMultilevel"/>
     <w:tmpl w:val="FFFFFFFF"/>
@@ -10585,7 +10278,7 @@
       </w:rPr>
     </w:lvl>
   </w:abstractNum>
-  <w:abstractNum w:abstractNumId="19" w15:restartNumberingAfterBreak="0">
+  <w:abstractNum w:abstractNumId="20" w15:restartNumberingAfterBreak="0">
     <w:nsid w:val="321C0DC5"/>
     <w:multiLevelType w:val="multilevel"/>
     <w:tmpl w:val="FFFFFFFF"/>
@@ -10698,7 +10391,7 @@
       </w:rPr>
     </w:lvl>
   </w:abstractNum>
-  <w:abstractNum w:abstractNumId="20" w15:restartNumberingAfterBreak="0">
+  <w:abstractNum w:abstractNumId="21" w15:restartNumberingAfterBreak="0">
     <w:nsid w:val="32BF17E8"/>
     <w:multiLevelType w:val="hybridMultilevel"/>
     <w:tmpl w:val="FFFFFFFF"/>
@@ -10811,7 +10504,7 @@
       </w:rPr>
     </w:lvl>
   </w:abstractNum>
-  <w:abstractNum w:abstractNumId="21" w15:restartNumberingAfterBreak="0">
+  <w:abstractNum w:abstractNumId="22" w15:restartNumberingAfterBreak="0">
     <w:nsid w:val="345D10A9"/>
     <w:multiLevelType w:val="hybridMultilevel"/>
     <w:tmpl w:val="FFFFFFFF"/>
@@ -10924,7 +10617,7 @@
       </w:rPr>
     </w:lvl>
   </w:abstractNum>
-  <w:abstractNum w:abstractNumId="22" w15:restartNumberingAfterBreak="0">
+  <w:abstractNum w:abstractNumId="23" w15:restartNumberingAfterBreak="0">
     <w:nsid w:val="3FC81421"/>
     <w:multiLevelType w:val="hybridMultilevel"/>
     <w:tmpl w:val="FFFFFFFF"/>
@@ -11037,7 +10730,7 @@
       </w:rPr>
     </w:lvl>
   </w:abstractNum>
-  <w:abstractNum w:abstractNumId="23" w15:restartNumberingAfterBreak="0">
+  <w:abstractNum w:abstractNumId="24" w15:restartNumberingAfterBreak="0">
     <w:nsid w:val="45D83003"/>
     <w:multiLevelType w:val="multilevel"/>
     <w:tmpl w:val="FFFFFFFF"/>
@@ -11186,7 +10879,7 @@
       </w:rPr>
     </w:lvl>
   </w:abstractNum>
-  <w:abstractNum w:abstractNumId="24" w15:restartNumberingAfterBreak="0">
+  <w:abstractNum w:abstractNumId="25" w15:restartNumberingAfterBreak="0">
     <w:nsid w:val="487864F5"/>
     <w:multiLevelType w:val="hybridMultilevel"/>
     <w:tmpl w:val="FFFFFFFF"/>
@@ -11324,7 +11017,7 @@
       </w:rPr>
     </w:lvl>
   </w:abstractNum>
-  <w:abstractNum w:abstractNumId="25" w15:restartNumberingAfterBreak="0">
+  <w:abstractNum w:abstractNumId="26" w15:restartNumberingAfterBreak="0">
     <w:nsid w:val="4F44182C"/>
     <w:multiLevelType w:val="hybridMultilevel"/>
     <w:tmpl w:val="FFFFFFFF"/>
@@ -11463,7 +11156,7 @@
       </w:rPr>
     </w:lvl>
   </w:abstractNum>
-  <w:abstractNum w:abstractNumId="26" w15:restartNumberingAfterBreak="0">
+  <w:abstractNum w:abstractNumId="27" w15:restartNumberingAfterBreak="0">
     <w:nsid w:val="538E4577"/>
     <w:multiLevelType w:val="hybridMultilevel"/>
     <w:tmpl w:val="FFFFFFFF"/>
@@ -11576,7 +11269,7 @@
       </w:rPr>
     </w:lvl>
   </w:abstractNum>
-  <w:abstractNum w:abstractNumId="27" w15:restartNumberingAfterBreak="0">
+  <w:abstractNum w:abstractNumId="28" w15:restartNumberingAfterBreak="0">
     <w:nsid w:val="61DA25AD"/>
     <w:multiLevelType w:val="multilevel"/>
     <w:tmpl w:val="FFFFFFFF"/>
@@ -11689,7 +11382,7 @@
       </w:rPr>
     </w:lvl>
   </w:abstractNum>
-  <w:abstractNum w:abstractNumId="28" w15:restartNumberingAfterBreak="0">
+  <w:abstractNum w:abstractNumId="29" w15:restartNumberingAfterBreak="0">
     <w:nsid w:val="62233511"/>
     <w:multiLevelType w:val="hybridMultilevel"/>
     <w:tmpl w:val="FFFFFFFF"/>
@@ -11802,7 +11495,7 @@
       </w:rPr>
     </w:lvl>
   </w:abstractNum>
-  <w:abstractNum w:abstractNumId="29" w15:restartNumberingAfterBreak="0">
+  <w:abstractNum w:abstractNumId="30" w15:restartNumberingAfterBreak="0">
     <w:nsid w:val="68B65AF0"/>
     <w:multiLevelType w:val="multilevel"/>
     <w:tmpl w:val="FFFFFFFF"/>
@@ -11915,7 +11608,7 @@
       </w:rPr>
     </w:lvl>
   </w:abstractNum>
-  <w:abstractNum w:abstractNumId="30" w15:restartNumberingAfterBreak="0">
+  <w:abstractNum w:abstractNumId="31" w15:restartNumberingAfterBreak="0">
     <w:nsid w:val="6C2A5CAE"/>
     <w:multiLevelType w:val="hybridMultilevel"/>
     <w:tmpl w:val="FFFFFFFF"/>
@@ -12028,7 +11721,7 @@
       </w:rPr>
     </w:lvl>
   </w:abstractNum>
-  <w:abstractNum w:abstractNumId="31" w15:restartNumberingAfterBreak="0">
+  <w:abstractNum w:abstractNumId="32" w15:restartNumberingAfterBreak="0">
     <w:nsid w:val="6C8F08CF"/>
     <w:multiLevelType w:val="hybridMultilevel"/>
     <w:tmpl w:val="FFFFFFFF"/>
@@ -12141,7 +11834,7 @@
       </w:rPr>
     </w:lvl>
   </w:abstractNum>
-  <w:abstractNum w:abstractNumId="32" w15:restartNumberingAfterBreak="0">
+  <w:abstractNum w:abstractNumId="33" w15:restartNumberingAfterBreak="0">
     <w:nsid w:val="736B2260"/>
     <w:multiLevelType w:val="hybridMultilevel"/>
     <w:tmpl w:val="FFFFFFFF"/>
@@ -12279,7 +11972,7 @@
       </w:rPr>
     </w:lvl>
   </w:abstractNum>
-  <w:abstractNum w:abstractNumId="33" w15:restartNumberingAfterBreak="0">
+  <w:abstractNum w:abstractNumId="34" w15:restartNumberingAfterBreak="0">
     <w:nsid w:val="736C40E3"/>
     <w:multiLevelType w:val="hybridMultilevel"/>
     <w:tmpl w:val="FFFFFFFF"/>
@@ -12392,7 +12085,7 @@
       </w:rPr>
     </w:lvl>
   </w:abstractNum>
-  <w:abstractNum w:abstractNumId="34" w15:restartNumberingAfterBreak="0">
+  <w:abstractNum w:abstractNumId="35" w15:restartNumberingAfterBreak="0">
     <w:nsid w:val="741643F3"/>
     <w:multiLevelType w:val="hybridMultilevel"/>
     <w:tmpl w:val="FFFFFFFF"/>
@@ -12505,7 +12198,7 @@
       </w:rPr>
     </w:lvl>
   </w:abstractNum>
-  <w:abstractNum w:abstractNumId="35" w15:restartNumberingAfterBreak="0">
+  <w:abstractNum w:abstractNumId="36" w15:restartNumberingAfterBreak="0">
     <w:nsid w:val="756B5377"/>
     <w:multiLevelType w:val="hybridMultilevel"/>
     <w:tmpl w:val="FFFFFFFF"/>
@@ -12618,7 +12311,7 @@
       </w:rPr>
     </w:lvl>
   </w:abstractNum>
-  <w:abstractNum w:abstractNumId="36" w15:restartNumberingAfterBreak="0">
+  <w:abstractNum w:abstractNumId="37" w15:restartNumberingAfterBreak="0">
     <w:nsid w:val="782038EF"/>
     <w:multiLevelType w:val="hybridMultilevel"/>
     <w:tmpl w:val="FFFFFFFF"/>
@@ -12757,7 +12450,7 @@
       </w:rPr>
     </w:lvl>
   </w:abstractNum>
-  <w:abstractNum w:abstractNumId="37" w15:restartNumberingAfterBreak="0">
+  <w:abstractNum w:abstractNumId="38" w15:restartNumberingAfterBreak="0">
     <w:nsid w:val="7880210B"/>
     <w:multiLevelType w:val="hybridMultilevel"/>
     <w:tmpl w:val="FFFFFFFF"/>
@@ -12896,7 +12589,7 @@
       </w:rPr>
     </w:lvl>
   </w:abstractNum>
-  <w:abstractNum w:abstractNumId="38" w15:restartNumberingAfterBreak="0">
+  <w:abstractNum w:abstractNumId="39" w15:restartNumberingAfterBreak="0">
     <w:nsid w:val="7A5D1D1F"/>
     <w:multiLevelType w:val="hybridMultilevel"/>
     <w:tmpl w:val="FFFFFFFF"/>
@@ -13009,7 +12702,7 @@
       </w:rPr>
     </w:lvl>
   </w:abstractNum>
-  <w:abstractNum w:abstractNumId="39" w15:restartNumberingAfterBreak="0">
+  <w:abstractNum w:abstractNumId="40" w15:restartNumberingAfterBreak="0">
     <w:nsid w:val="7D7F562C"/>
     <w:multiLevelType w:val="hybridMultilevel"/>
     <w:tmpl w:val="FFFFFFFF"/>
@@ -13153,25 +12846,25 @@
     <w:abstractNumId w:val="0"/>
   </w:num>
   <w:num w:numId="11" w16cid:durableId="1620601614">
-    <w:abstractNumId w:val="34"/>
+    <w:abstractNumId w:val="35"/>
   </w:num>
   <w:num w:numId="12" w16cid:durableId="872499104">
     <w:abstractNumId w:val="11"/>
   </w:num>
   <w:num w:numId="13" w16cid:durableId="463088373">
-    <w:abstractNumId w:val="38"/>
+    <w:abstractNumId w:val="39"/>
   </w:num>
   <w:num w:numId="14" w16cid:durableId="1075393544">
-    <w:abstractNumId w:val="14"/>
+    <w:abstractNumId w:val="15"/>
   </w:num>
   <w:num w:numId="15" w16cid:durableId="1304966022">
-    <w:abstractNumId w:val="14"/>
+    <w:abstractNumId w:val="15"/>
   </w:num>
   <w:num w:numId="16" w16cid:durableId="1707676311">
-    <w:abstractNumId w:val="27"/>
+    <w:abstractNumId w:val="28"/>
   </w:num>
   <w:num w:numId="17" w16cid:durableId="1732776461">
-    <w:abstractNumId w:val="27"/>
+    <w:abstractNumId w:val="28"/>
     <w:lvlOverride w:ilvl="0">
       <w:startOverride w:val="1"/>
     </w:lvlOverride>
@@ -13201,79 +12894,82 @@
     </w:lvlOverride>
   </w:num>
   <w:num w:numId="18" w16cid:durableId="959650366">
-    <w:abstractNumId w:val="19"/>
+    <w:abstractNumId w:val="20"/>
   </w:num>
   <w:num w:numId="19" w16cid:durableId="1759643061">
-    <w:abstractNumId w:val="29"/>
+    <w:abstractNumId w:val="30"/>
   </w:num>
   <w:num w:numId="20" w16cid:durableId="370691054">
-    <w:abstractNumId w:val="17"/>
+    <w:abstractNumId w:val="18"/>
   </w:num>
   <w:num w:numId="21" w16cid:durableId="1066152229">
     <w:abstractNumId w:val="10"/>
   </w:num>
   <w:num w:numId="22" w16cid:durableId="588536977">
-    <w:abstractNumId w:val="28"/>
+    <w:abstractNumId w:val="29"/>
   </w:num>
   <w:num w:numId="23" w16cid:durableId="1686204732">
+    <w:abstractNumId w:val="17"/>
+  </w:num>
+  <w:num w:numId="24" w16cid:durableId="1704791163">
+    <w:abstractNumId w:val="22"/>
+  </w:num>
+  <w:num w:numId="25" w16cid:durableId="1872841886">
+    <w:abstractNumId w:val="23"/>
+  </w:num>
+  <w:num w:numId="26" w16cid:durableId="180512610">
+    <w:abstractNumId w:val="21"/>
+  </w:num>
+  <w:num w:numId="27" w16cid:durableId="1835418408">
+    <w:abstractNumId w:val="19"/>
+  </w:num>
+  <w:num w:numId="28" w16cid:durableId="566309931">
+    <w:abstractNumId w:val="40"/>
+  </w:num>
+  <w:num w:numId="29" w16cid:durableId="305353249">
+    <w:abstractNumId w:val="31"/>
+  </w:num>
+  <w:num w:numId="30" w16cid:durableId="2110421744">
+    <w:abstractNumId w:val="36"/>
+  </w:num>
+  <w:num w:numId="31" w16cid:durableId="346442177">
     <w:abstractNumId w:val="16"/>
   </w:num>
-  <w:num w:numId="24" w16cid:durableId="1704791163">
-    <w:abstractNumId w:val="21"/>
+  <w:num w:numId="32" w16cid:durableId="1095588327">
+    <w:abstractNumId w:val="34"/>
   </w:num>
-  <w:num w:numId="25" w16cid:durableId="1872841886">
-    <w:abstractNumId w:val="22"/>
+  <w:num w:numId="33" w16cid:durableId="1166939223">
+    <w:abstractNumId w:val="24"/>
   </w:num>
-  <w:num w:numId="26" w16cid:durableId="180512610">
-    <w:abstractNumId w:val="20"/>
+  <w:num w:numId="34" w16cid:durableId="2143955788">
+    <w:abstractNumId w:val="13"/>
   </w:num>
-  <w:num w:numId="27" w16cid:durableId="1835418408">
-    <w:abstractNumId w:val="18"/>
+  <w:num w:numId="35" w16cid:durableId="883758079">
+    <w:abstractNumId w:val="32"/>
   </w:num>
-  <w:num w:numId="28" w16cid:durableId="566309931">
-    <w:abstractNumId w:val="39"/>
+  <w:num w:numId="36" w16cid:durableId="1590962620">
+    <w:abstractNumId w:val="14"/>
   </w:num>
-  <w:num w:numId="29" w16cid:durableId="305353249">
-    <w:abstractNumId w:val="30"/>
+  <w:num w:numId="37" w16cid:durableId="1316644112">
+    <w:abstractNumId w:val="27"/>
   </w:num>
-  <w:num w:numId="30" w16cid:durableId="2110421744">
-    <w:abstractNumId w:val="35"/>
+  <w:num w:numId="38" w16cid:durableId="1400320726">
+    <w:abstractNumId w:val="25"/>
   </w:num>
-  <w:num w:numId="31" w16cid:durableId="346442177">
-    <w:abstractNumId w:val="15"/>
-  </w:num>
-  <w:num w:numId="32" w16cid:durableId="1095588327">
+  <w:num w:numId="39" w16cid:durableId="184756393">
     <w:abstractNumId w:val="33"/>
   </w:num>
-  <w:num w:numId="33" w16cid:durableId="1166939223">
-    <w:abstractNumId w:val="23"/>
+  <w:num w:numId="40" w16cid:durableId="495652671">
+    <w:abstractNumId w:val="38"/>
   </w:num>
-  <w:num w:numId="34" w16cid:durableId="2143955788">
-    <w:abstractNumId w:val="12"/>
-  </w:num>
-  <w:num w:numId="35" w16cid:durableId="883758079">
-    <w:abstractNumId w:val="31"/>
-  </w:num>
-  <w:num w:numId="36" w16cid:durableId="1590962620">
-    <w:abstractNumId w:val="13"/>
-  </w:num>
-  <w:num w:numId="37" w16cid:durableId="1316644112">
+  <w:num w:numId="41" w16cid:durableId="371155510">
     <w:abstractNumId w:val="26"/>
   </w:num>
-  <w:num w:numId="38" w16cid:durableId="1400320726">
-    <w:abstractNumId w:val="24"/>
-  </w:num>
-  <w:num w:numId="39" w16cid:durableId="184756393">
-    <w:abstractNumId w:val="32"/>
-  </w:num>
-  <w:num w:numId="40" w16cid:durableId="495652671">
+  <w:num w:numId="42" w16cid:durableId="81948548">
     <w:abstractNumId w:val="37"/>
   </w:num>
-  <w:num w:numId="41" w16cid:durableId="371155510">
-    <w:abstractNumId w:val="25"/>
-  </w:num>
-  <w:num w:numId="42" w16cid:durableId="81948548">
-    <w:abstractNumId w:val="36"/>
+  <w:num w:numId="43" w16cid:durableId="854152714">
+    <w:abstractNumId w:val="12"/>
   </w:num>
 </w:numbering>
 </file>
@@ -14578,6 +14274,21 @@
 </file>
 
 <file path=customXml/item1.xml><?xml version="1.0" encoding="utf-8"?>
+<?mso-contentType ?>
+<FormTemplates xmlns="http://schemas.microsoft.com/sharepoint/v3/contenttype/forms">
+  <Display>DocumentLibraryForm</Display>
+  <Edit>DocumentLibraryForm</Edit>
+  <New>DocumentLibraryForm</New>
+</FormTemplates>
+</file>
+
+<file path=customXml/item2.xml><?xml version="1.0" encoding="utf-8"?>
+<p:properties xmlns:p="http://schemas.microsoft.com/office/2006/metadata/properties" xmlns:xsi="http://www.w3.org/2001/XMLSchema-instance" xmlns:pc="http://schemas.microsoft.com/office/infopath/2007/PartnerControls">
+  <documentManagement/>
+</p:properties>
+</file>
+
+<file path=customXml/item3.xml><?xml version="1.0" encoding="utf-8"?>
 <ct:contentTypeSchema xmlns:ct="http://schemas.microsoft.com/office/2006/metadata/contentType" xmlns:ma="http://schemas.microsoft.com/office/2006/metadata/properties/metaAttributes" ct:_="" ma:_="" ma:contentTypeName="Dokument" ma:contentTypeID="0x010100EEC585885EB71F4DB0D9FB45E4A66F2C" ma:contentTypeVersion="3" ma:contentTypeDescription="Opprett et nytt dokument." ma:contentTypeScope="" ma:versionID="f382b6a2fd235f283bf5cecf5e56262d">
   <xsd:schema xmlns:xsd="http://www.w3.org/2001/XMLSchema" xmlns:xs="http://www.w3.org/2001/XMLSchema" xmlns:p="http://schemas.microsoft.com/office/2006/metadata/properties" xmlns:ns2="e2dd498c-680f-4fa4-b475-961296ca3ef1" targetNamespace="http://schemas.microsoft.com/office/2006/metadata/properties" ma:root="true" ma:fieldsID="c7bc32ed49db3fd258cd61b46b16d772" ns2:_="">
     <xsd:import namespace="e2dd498c-680f-4fa4-b475-961296ca3ef1"/>
@@ -14715,22 +14426,125 @@
 </ct:contentTypeSchema>
 </file>
 
-<file path=customXml/item2.xml><?xml version="1.0" encoding="utf-8"?>
-<p:properties xmlns:p="http://schemas.microsoft.com/office/2006/metadata/properties" xmlns:xsi="http://www.w3.org/2001/XMLSchema-instance" xmlns:pc="http://schemas.microsoft.com/office/infopath/2007/PartnerControls">
-  <documentManagement/>
-</p:properties>
-</file>
-
-<file path=customXml/item3.xml><?xml version="1.0" encoding="utf-8"?>
-<?mso-contentType ?>
-<FormTemplates xmlns="http://schemas.microsoft.com/sharepoint/v3/contenttype/forms">
-  <Display>DocumentLibraryForm</Display>
-  <Edit>DocumentLibraryForm</Edit>
-  <New>DocumentLibraryForm</New>
-</FormTemplates>
+<file path=customXml/item4.xml><?xml version="1.0" encoding="utf-8"?>
+<b:Sources xmlns:b="http://schemas.openxmlformats.org/officeDocument/2006/bibliography" xmlns="http://schemas.openxmlformats.org/officeDocument/2006/bibliography" SelectedStyle="/APASixthEditionOfficeOnline.xsl" StyleName="APA" Version="6">
+  <b:Source>
+    <b:Tag>Jos26</b:Tag>
+    <b:SourceType>InternetSite</b:SourceType>
+    <b:Guid>{8A76D241-BD97-344D-8E17-F1E528A5028F}</b:Guid>
+    <b:Title>IBM</b:Title>
+    <b:Year>2026</b:Year>
+    <b:InternetSiteTitle>IBM.com</b:InternetSiteTitle>
+    <b:URL>https://www.ibm.com/think/topics/arima-model</b:URL>
+    <b:Author>
+      <b:Author>
+        <b:NameList>
+          <b:Person>
+            <b:Last>Noble</b:Last>
+            <b:First>Josuha</b:First>
+          </b:Person>
+        </b:NameList>
+      </b:Author>
+    </b:Author>
+    <b:RefOrder>2</b:RefOrder>
+  </b:Source>
+  <b:Source>
+    <b:Tag>Men262</b:Tag>
+    <b:SourceType>Report</b:SourceType>
+    <b:Guid>{61F0561F-5DD7-0345-9677-37B163283E2A}</b:Guid>
+    <b:Author>
+      <b:Author>
+        <b:Corporate>Menon Economics</b:Corporate>
+      </b:Author>
+    </b:Author>
+    <b:Title>Maritim Verdiskapning 2026</b:Title>
+    <b:Year>2026</b:Year>
+    <b:Publisher>Maritimt Forum</b:Publisher>
+    <b:RefOrder>1</b:RefOrder>
+  </b:Source>
+  <b:Source>
+    <b:Tag>Spy18</b:Tag>
+    <b:SourceType>ArticleInAPeriodical</b:SourceType>
+    <b:Guid>{E10E726D-13D9-5D47-AEFB-879CCAC3230A}</b:Guid>
+    <b:Title>The M4 Competition: Results, findings, conclusion and way forward</b:Title>
+    <b:Year>2018</b:Year>
+    <b:Author>
+      <b:Author>
+        <b:NameList>
+          <b:Person>
+            <b:Last>Spyros Makridakis</b:Last>
+            <b:First>Evangelos</b:First>
+            <b:Middle>Spiliotis, Vassilios Assimakopoulos</b:Middle>
+          </b:Person>
+        </b:NameList>
+      </b:Author>
+    </b:Author>
+    <b:PeriodicalTitle>International Journal of Forecasting</b:PeriodicalTitle>
+    <b:RefOrder>4</b:RefOrder>
+  </b:Source>
+  <b:Source>
+    <b:Tag>Rea06</b:Tag>
+    <b:SourceType>ArticleInAPeriodical</b:SourceType>
+    <b:Guid>{D1CE0CBB-182F-E84C-856B-EBE90A745453}</b:Guid>
+    <b:Author>
+      <b:Author>
+        <b:NameList>
+          <b:Person>
+            <b:Last>Real Carbonneau</b:Last>
+            <b:First>Kevin</b:First>
+            <b:Middle>Laframboise, Rustam Vahidov</b:Middle>
+          </b:Person>
+        </b:NameList>
+      </b:Author>
+    </b:Author>
+    <b:Title>Application of machine learning techniques for supply chain demand forecasting</b:Title>
+    <b:PeriodicalTitle>European Journal of Operational Research</b:PeriodicalTitle>
+    <b:Year>2006</b:Year>
+    <b:Month>Desember</b:Month>
+    <b:RefOrder>3</b:RefOrder>
+  </b:Source>
+  <b:Source>
+    <b:Tag>Nur23</b:Tag>
+    <b:SourceType>ArticleInAPeriodical</b:SourceType>
+    <b:Guid>{9B0D54B3-6D40-2C44-AFF2-C6C0374E4150}</b:Guid>
+    <b:Author>
+      <b:Author>
+        <b:NameList>
+          <b:Person>
+            <b:Last>Nur Assani</b:Last>
+            <b:First>Petar</b:First>
+            <b:Middle>Matic, Nediljko Kastelan and Ivan R. Čavka</b:Middle>
+          </b:Person>
+        </b:NameList>
+      </b:Author>
+    </b:Author>
+    <b:Title>A Review of Artificial Neural Networks Applications in Maritime Industry</b:Title>
+    <b:PeriodicalTitle>IEEE</b:PeriodicalTitle>
+    <b:Year>2023</b:Year>
+    <b:Month>Desember</b:Month>
+    <b:RefOrder>5</b:RefOrder>
+  </b:Source>
+</b:Sources>
 </file>
 
 <file path=customXml/itemProps1.xml><?xml version="1.0" encoding="utf-8"?>
+<ds:datastoreItem xmlns:ds="http://schemas.openxmlformats.org/officeDocument/2006/customXml" ds:itemID="{15EDDDC4-FC70-4A17-B335-FA74CBA6D896}">
+  <ds:schemaRefs>
+    <ds:schemaRef ds:uri="http://schemas.microsoft.com/sharepoint/v3/contenttype/forms"/>
+  </ds:schemaRefs>
+</ds:datastoreItem>
+</file>
+
+<file path=customXml/itemProps2.xml><?xml version="1.0" encoding="utf-8"?>
+<ds:datastoreItem xmlns:ds="http://schemas.openxmlformats.org/officeDocument/2006/customXml" ds:itemID="{74AFE97E-FF41-453C-AD97-D425FF5A45AF}">
+  <ds:schemaRefs>
+    <ds:schemaRef ds:uri="http://schemas.microsoft.com/office/2006/metadata/properties"/>
+    <ds:schemaRef ds:uri="http://schemas.microsoft.com/office/infopath/2007/PartnerControls"/>
+  </ds:schemaRefs>
+</ds:datastoreItem>
+</file>
+
+<file path=customXml/itemProps3.xml><?xml version="1.0" encoding="utf-8"?>
 <ds:datastoreItem xmlns:ds="http://schemas.openxmlformats.org/officeDocument/2006/customXml" ds:itemID="{F04B31DB-3A04-4C67-AFC6-FB4D572DB88B}">
   <ds:schemaRefs>
     <ds:schemaRef ds:uri="http://schemas.microsoft.com/office/2006/metadata/contentType"/>
@@ -14748,19 +14562,10 @@
 </ds:datastoreItem>
 </file>
 
-<file path=customXml/itemProps2.xml><?xml version="1.0" encoding="utf-8"?>
-<ds:datastoreItem xmlns:ds="http://schemas.openxmlformats.org/officeDocument/2006/customXml" ds:itemID="{74AFE97E-FF41-453C-AD97-D425FF5A45AF}">
+<file path=customXml/itemProps4.xml><?xml version="1.0" encoding="utf-8"?>
+<ds:datastoreItem xmlns:ds="http://schemas.openxmlformats.org/officeDocument/2006/customXml" ds:itemID="{16711374-8990-FF4C-B9C0-EDF9999C5205}">
   <ds:schemaRefs>
-    <ds:schemaRef ds:uri="http://schemas.microsoft.com/office/2006/metadata/properties"/>
-    <ds:schemaRef ds:uri="http://schemas.microsoft.com/office/infopath/2007/PartnerControls"/>
-  </ds:schemaRefs>
-</ds:datastoreItem>
-</file>
-
-<file path=customXml/itemProps3.xml><?xml version="1.0" encoding="utf-8"?>
-<ds:datastoreItem xmlns:ds="http://schemas.openxmlformats.org/officeDocument/2006/customXml" ds:itemID="{15EDDDC4-FC70-4A17-B335-FA74CBA6D896}">
-  <ds:schemaRefs>
-    <ds:schemaRef ds:uri="http://schemas.microsoft.com/sharepoint/v3/contenttype/forms"/>
+    <ds:schemaRef ds:uri="http://schemas.openxmlformats.org/officeDocument/2006/bibliography"/>
   </ds:schemaRefs>
 </ds:datastoreItem>
 </file>
</xml_diff>

<commit_message>
Uploaded sim data and also draft literature section
</commit_message>
<xml_diff>
--- a/014 fase 4 - report/Rapport prøving.docx
+++ b/014 fase 4 - report/Rapport prøving.docx
@@ -7450,6 +7450,459 @@
       <w:bookmarkEnd w:id="20"/>
     </w:p>
     <w:p>
+      <w:pPr>
+        <w:pStyle w:val="Overskrift2"/>
+        <w:numPr>
+          <w:ilvl w:val="0"/>
+          <w:numId w:val="0"/>
+        </w:numPr>
+      </w:pPr>
+    </w:p>
+    <w:p>
+      <w:pPr>
+        <w:pStyle w:val="Overskrift2"/>
+        <w:numPr>
+          <w:ilvl w:val="0"/>
+          <w:numId w:val="0"/>
+        </w:numPr>
+      </w:pPr>
+      <w:r>
+        <w:t>2.1 Prognostisering i logistikk: fra klassiske modeller til KI</w:t>
+      </w:r>
+    </w:p>
+    <w:p>
+      <w:pPr>
+        <w:pStyle w:val="NormalWeb"/>
+      </w:pPr>
+      <w:r>
+        <w:t xml:space="preserve">Prognostisering er en kjerneaktivitet i logistikk og operasjonsstyring fordi etterspørsels- og kapasitetsusikkerhet påvirker planlegging av ressurser, kontrakter og beredskap. Tradisjonelle tidsseriemodeller (som </w:t>
+      </w:r>
+      <w:proofErr w:type="spellStart"/>
+      <w:r>
+        <w:t>ARIMA</w:t>
+      </w:r>
+      <w:proofErr w:type="spellEnd"/>
+      <w:r>
+        <w:t xml:space="preserve">/ETS) er fortsatt mye brukt i praksis, men de siste årene har forskningen i økende grad undersøkt maskinlæring og dyp læring for å håndtere mer komplekse datastrukturer og ikke-lineære sammenhenger. En kritisk gjennomgang av ML/DL i etterspørselsprognoser i supply chain-litteraturen viser nettopp denne dreiningen og oppsummerer hvordan moderne KI-metoder ofte er særlig nyttige når datasettet inkluderer mange forklaringsvariabler og komplekse mønstre. </w:t>
+      </w:r>
+    </w:p>
+    <w:p>
+      <w:pPr>
+        <w:pStyle w:val="NormalWeb"/>
+      </w:pPr>
+      <w:r>
+        <w:t xml:space="preserve">For denne rapporten er poenget ikke å “erstatte” klassiske metoder, men å teste om </w:t>
+      </w:r>
+      <w:r>
+        <w:rPr>
+          <w:rStyle w:val="Sterk"/>
+        </w:rPr>
+        <w:t>valg av modellfamilie</w:t>
+      </w:r>
+      <w:r>
+        <w:t xml:space="preserve"> (tradisjonell tidsserie </w:t>
+      </w:r>
+      <w:proofErr w:type="spellStart"/>
+      <w:r>
+        <w:t>vs</w:t>
+      </w:r>
+      <w:proofErr w:type="spellEnd"/>
+      <w:r>
+        <w:t xml:space="preserve"> maskinlæring) faktisk gir målbare forskjeller i prediksjonsytelse i en offshore-kontekst der både tekniske og markedsmessige forhold kan påvirke sannsynligheten for </w:t>
+      </w:r>
+      <w:proofErr w:type="spellStart"/>
+      <w:r>
+        <w:t>offhire</w:t>
+      </w:r>
+      <w:proofErr w:type="spellEnd"/>
+      <w:r>
+        <w:t>.</w:t>
+      </w:r>
+    </w:p>
+    <w:p>
+      <w:pPr>
+        <w:pStyle w:val="Overskrift2"/>
+        <w:numPr>
+          <w:ilvl w:val="0"/>
+          <w:numId w:val="0"/>
+        </w:numPr>
+        <w:ind w:left="576" w:hanging="576"/>
+      </w:pPr>
+      <w:r>
+        <w:t>2.2 Konkurranser og evidensgrunnlag for modellvalg</w:t>
+      </w:r>
+    </w:p>
+    <w:p>
+      <w:pPr>
+        <w:pStyle w:val="NormalWeb"/>
+      </w:pPr>
+      <w:r>
+        <w:t>Et viktig empirisk bidrag de siste årene er M5-konkurransen, som viser hvordan avanserte maskinlæringsmetoder (ofte ensemble-/</w:t>
+      </w:r>
+      <w:proofErr w:type="spellStart"/>
+      <w:r>
+        <w:t>trebaserte</w:t>
+      </w:r>
+      <w:proofErr w:type="spellEnd"/>
+      <w:r>
+        <w:t xml:space="preserve"> og </w:t>
+      </w:r>
+      <w:proofErr w:type="spellStart"/>
+      <w:r>
+        <w:t>feature</w:t>
+      </w:r>
+      <w:proofErr w:type="spellEnd"/>
+      <w:r>
+        <w:t xml:space="preserve">-rike) kan prestere svært godt i krevende prognosemiljøer med mange tidsserier og kompleks struktur. Selv om M5-dataene kommer fra detaljhandel, er hovedpoenget overførbart til andre domener: når prognoseproblemet er komplekst og påvirkes av flere drivere, kan modeller som utnytter rike forklaringsvariabler og ikke-linearitet gi bedre prediksjoner. </w:t>
+      </w:r>
+    </w:p>
+    <w:p>
+      <w:pPr>
+        <w:pStyle w:val="NormalWeb"/>
+      </w:pPr>
+      <w:r>
+        <w:t>I rapporten din fungerer M5 derfor som et metodisk argument for hvorfor det er relevant å sammenligne tradisjonelle tidsseriemetoder mot KI-modeller – og hvorfor forbedring (hvis den finnes) kan være mest tydelig under varierende markedsforhold og operasjonell kompleksitet.</w:t>
+      </w:r>
+    </w:p>
+    <w:p>
+      <w:pPr>
+        <w:pStyle w:val="Overskrift2"/>
+        <w:numPr>
+          <w:ilvl w:val="0"/>
+          <w:numId w:val="0"/>
+        </w:numPr>
+        <w:ind w:left="576" w:hanging="576"/>
+      </w:pPr>
+      <w:r>
+        <w:lastRenderedPageBreak/>
+        <w:t xml:space="preserve">2.3 Dyp læring for tidsserier: </w:t>
+      </w:r>
+      <w:proofErr w:type="spellStart"/>
+      <w:r>
+        <w:t>interpretérbarhet</w:t>
+      </w:r>
+      <w:proofErr w:type="spellEnd"/>
+      <w:r>
+        <w:t xml:space="preserve"> og </w:t>
+      </w:r>
+      <w:proofErr w:type="spellStart"/>
+      <w:r>
+        <w:t>multi</w:t>
+      </w:r>
+      <w:proofErr w:type="spellEnd"/>
+      <w:r>
+        <w:t>-horisont</w:t>
+      </w:r>
+    </w:p>
+    <w:p>
+      <w:pPr>
+        <w:pStyle w:val="NormalWeb"/>
+      </w:pPr>
+      <w:r>
+        <w:t xml:space="preserve">Innen moderne tidsserieprognostisering har dyp læring utviklet seg raskt, spesielt for </w:t>
+      </w:r>
+      <w:proofErr w:type="spellStart"/>
+      <w:r>
+        <w:rPr>
+          <w:rStyle w:val="Sterk"/>
+        </w:rPr>
+        <w:t>multi</w:t>
+      </w:r>
+      <w:proofErr w:type="spellEnd"/>
+      <w:r>
+        <w:rPr>
+          <w:rStyle w:val="Sterk"/>
+        </w:rPr>
+        <w:t>-horisont-prognoser</w:t>
+      </w:r>
+      <w:r>
+        <w:t xml:space="preserve"> og situasjoner med både historiske og “kjente fremtidige” variabler. Temporal </w:t>
+      </w:r>
+      <w:proofErr w:type="spellStart"/>
+      <w:r>
+        <w:t>Fusion</w:t>
+      </w:r>
+      <w:proofErr w:type="spellEnd"/>
+      <w:r>
+        <w:t xml:space="preserve"> Transformer (TFT) er et sentralt bidrag i perioden, både fordi modellen sikter mot høy ytelse og fordi den tilbyr mekanismer for </w:t>
+      </w:r>
+      <w:proofErr w:type="spellStart"/>
+      <w:r>
+        <w:t>interpretérbarhet</w:t>
+      </w:r>
+      <w:proofErr w:type="spellEnd"/>
+      <w:r>
+        <w:t xml:space="preserve"> (f.eks. variabelviktighet og oppmerksomhetsstrukturer). </w:t>
+      </w:r>
+    </w:p>
+    <w:p>
+      <w:pPr>
+        <w:pStyle w:val="NormalWeb"/>
+      </w:pPr>
+      <w:r>
+        <w:t xml:space="preserve">I tillegg oppsummerer nyere oversiktsartikler hvordan feltet har beveget seg mot transformer-baserte arkitekturer, forbedret </w:t>
+      </w:r>
+      <w:proofErr w:type="spellStart"/>
+      <w:r>
+        <w:t>feature</w:t>
+      </w:r>
+      <w:proofErr w:type="spellEnd"/>
+      <w:r>
+        <w:t xml:space="preserve">-håndtering og mer systematiske evalueringsoppsett. </w:t>
+      </w:r>
+    </w:p>
+    <w:p>
+      <w:pPr>
+        <w:pStyle w:val="NormalWeb"/>
+      </w:pPr>
+      <w:r>
+        <w:t>For problemstillingen din er dette relevant på to måter: (1) det begrunner hvorfor KI-modeller kan være aktuelle kandidater, og (2) det peker på en praktisk utfordring i offshore: “</w:t>
+      </w:r>
+      <w:proofErr w:type="spellStart"/>
+      <w:r>
+        <w:t>black</w:t>
+      </w:r>
+      <w:proofErr w:type="spellEnd"/>
+      <w:r>
+        <w:t xml:space="preserve"> </w:t>
+      </w:r>
+      <w:proofErr w:type="spellStart"/>
+      <w:r>
+        <w:t>box</w:t>
+      </w:r>
+      <w:proofErr w:type="spellEnd"/>
+      <w:r>
+        <w:t xml:space="preserve">”-problematikk. Selv om rapporten din primært måler prediktiv ytelse, er det nyttig å forankre at deler av KI-litteraturen også adresserer </w:t>
+      </w:r>
+      <w:proofErr w:type="spellStart"/>
+      <w:r>
+        <w:t>interpretérbarhet</w:t>
+      </w:r>
+      <w:proofErr w:type="spellEnd"/>
+      <w:r>
+        <w:t>.</w:t>
+      </w:r>
+    </w:p>
+    <w:p>
+      <w:pPr>
+        <w:pStyle w:val="Overskrift2"/>
+        <w:numPr>
+          <w:ilvl w:val="0"/>
+          <w:numId w:val="0"/>
+        </w:numPr>
+        <w:ind w:left="576" w:hanging="576"/>
+      </w:pPr>
+      <w:r>
+        <w:t>2.4 Prognoser under usikkerhet: probabilistiske tilnærminger og robusthet</w:t>
+      </w:r>
+    </w:p>
+    <w:p>
+      <w:pPr>
+        <w:pStyle w:val="NormalWeb"/>
+      </w:pPr>
+      <w:r>
+        <w:t xml:space="preserve">En viktig trend de siste 5 årene er økt </w:t>
+      </w:r>
+      <w:proofErr w:type="gramStart"/>
+      <w:r>
+        <w:t>fokus</w:t>
+      </w:r>
+      <w:proofErr w:type="gramEnd"/>
+      <w:r>
+        <w:t xml:space="preserve"> på </w:t>
+      </w:r>
+      <w:r>
+        <w:rPr>
+          <w:rStyle w:val="Sterk"/>
+        </w:rPr>
+        <w:t>probabilistiske prognoser</w:t>
+      </w:r>
+      <w:r>
+        <w:t xml:space="preserve">, altså å predikere en fordeling eller usikkerhetsintervall heller enn ett punktestimat. Dette er spesielt relevant i miljøer med høy varians og “sjeldne hendelser”, der beslutninger må ta høyde for risiko. Nyere forskning på kombinasjon av probabilistiske prognoser for intermittent </w:t>
+      </w:r>
+      <w:proofErr w:type="spellStart"/>
+      <w:r>
+        <w:t>demand</w:t>
+      </w:r>
+      <w:proofErr w:type="spellEnd"/>
+      <w:r>
+        <w:t xml:space="preserve"> viser hvordan både nøyaktighet og beslutningsnytte kan påvirkes av valg av metode og evalueringskriterier. </w:t>
+      </w:r>
+    </w:p>
+    <w:p>
+      <w:pPr>
+        <w:pStyle w:val="NormalWeb"/>
+      </w:pPr>
+      <w:r>
+        <w:t>I din rapport kan dette brukes til å motivere hvorfor “robusthet” må operasjonaliseres konkret (f.eks. stabil ytelse på tvers av perioder med ulike markedsregimer), selv om du velger å rapportere primært punktbaserte mål (MAE/</w:t>
+      </w:r>
+      <w:proofErr w:type="spellStart"/>
+      <w:r>
+        <w:t>RMSE</w:t>
+      </w:r>
+      <w:proofErr w:type="spellEnd"/>
+      <w:r>
+        <w:t>/F1/</w:t>
+      </w:r>
+      <w:proofErr w:type="spellStart"/>
+      <w:r>
+        <w:t>AUC</w:t>
+      </w:r>
+      <w:proofErr w:type="spellEnd"/>
+      <w:r>
+        <w:t>). Poenget i litteraturen er at usikkerhet ikke bare er “støy”, men en sentral egenskap ved problemet.</w:t>
+      </w:r>
+    </w:p>
+    <w:p>
+      <w:pPr>
+        <w:pStyle w:val="Overskrift2"/>
+        <w:numPr>
+          <w:ilvl w:val="0"/>
+          <w:numId w:val="0"/>
+        </w:numPr>
+        <w:ind w:left="576" w:hanging="576"/>
+      </w:pPr>
+      <w:r>
+        <w:t>2.5 Maritime og offshore-anvendelser: fra prediktivt vedlikehold til PSV-marked</w:t>
+      </w:r>
+    </w:p>
+    <w:p>
+      <w:pPr>
+        <w:pStyle w:val="NormalWeb"/>
+      </w:pPr>
+      <w:r>
+        <w:t xml:space="preserve">Innen maritim forskning har KI de siste årene vært sterkt knyttet til prediktivt vedlikehold og pålitelighet, der målet ofte er å forutsi feil eller degradering basert på sensor- og driftsdata. En nyere oversiktsartikkel om prediktivt vedlikehold i maritim industri oppsummerer hvordan ML benyttes for å forutse feil og redusere uplanlagt nedetid. </w:t>
+      </w:r>
+    </w:p>
+    <w:p>
+      <w:pPr>
+        <w:pStyle w:val="NormalWeb"/>
+      </w:pPr>
+      <w:r>
+        <w:t xml:space="preserve">Mer direkte koblet til offshore-segmentet finnes det også forskning på </w:t>
+      </w:r>
+      <w:r>
+        <w:rPr>
+          <w:rStyle w:val="Sterk"/>
+        </w:rPr>
+        <w:t>PSV-marked og rater</w:t>
+      </w:r>
+      <w:r>
+        <w:t xml:space="preserve">. Kjeldsberg (2024) undersøker faktorer som påvirker PSV time charter-rater og demonstrerer </w:t>
+      </w:r>
+      <w:proofErr w:type="spellStart"/>
+      <w:r>
+        <w:t>AutoML</w:t>
+      </w:r>
+      <w:proofErr w:type="spellEnd"/>
+      <w:r>
+        <w:t xml:space="preserve">-modellering for å fange ikke-linearitet i fraktmarkedet, med prognoser på flere horisonter. </w:t>
+      </w:r>
+    </w:p>
+    <w:p>
+      <w:pPr>
+        <w:pStyle w:val="NormalWeb"/>
+      </w:pPr>
+      <w:r>
+        <w:lastRenderedPageBreak/>
+        <w:t xml:space="preserve">Dette er relevant for rapporten din fordi det viser at (a) offshore/PSV er et aktivt forskningsområde, og (b) moderne ML-metoder allerede brukes på nærliggende problemtyper (marked/kontrakt), noe som støtter relevansen av å teste tilsvarende metodikk mot </w:t>
+      </w:r>
+      <w:proofErr w:type="spellStart"/>
+      <w:r>
+        <w:t>offhire</w:t>
+      </w:r>
+      <w:proofErr w:type="spellEnd"/>
+      <w:r>
+        <w:t>-prediksjon.</w:t>
+      </w:r>
+    </w:p>
+    <w:p>
+      <w:pPr>
+        <w:pStyle w:val="Overskrift2"/>
+        <w:numPr>
+          <w:ilvl w:val="0"/>
+          <w:numId w:val="0"/>
+        </w:numPr>
+        <w:ind w:left="576" w:hanging="576"/>
+      </w:pPr>
+      <w:r>
+        <w:t xml:space="preserve">2.6 Oppsummering av </w:t>
+      </w:r>
+      <w:proofErr w:type="spellStart"/>
+      <w:r>
+        <w:t>forskningsgap</w:t>
+      </w:r>
+      <w:proofErr w:type="spellEnd"/>
+      <w:r>
+        <w:t xml:space="preserve"> og kobling til denne rapporten</w:t>
+      </w:r>
+    </w:p>
+    <w:p>
+      <w:pPr>
+        <w:pStyle w:val="NormalWeb"/>
+      </w:pPr>
+      <w:r>
+        <w:t xml:space="preserve">Oppsummert viser litteraturen de siste 5 årene (1) sterk vekst i ML/DL for prognostisering i logistikk, (2) økende evidens fra konkurranser og studier om at ML kan prestere godt i komplekse settinger, (3) metodisk utvikling innen </w:t>
+      </w:r>
+      <w:proofErr w:type="spellStart"/>
+      <w:r>
+        <w:t>multi</w:t>
+      </w:r>
+      <w:proofErr w:type="spellEnd"/>
+      <w:r>
+        <w:t xml:space="preserve">-horisont og </w:t>
+      </w:r>
+      <w:proofErr w:type="spellStart"/>
+      <w:r>
+        <w:t>interpretérbarhet</w:t>
+      </w:r>
+      <w:proofErr w:type="spellEnd"/>
+      <w:r>
+        <w:t xml:space="preserve">, samt (4) økt </w:t>
+      </w:r>
+      <w:proofErr w:type="gramStart"/>
+      <w:r>
+        <w:t>fokus</w:t>
+      </w:r>
+      <w:proofErr w:type="gramEnd"/>
+      <w:r>
+        <w:t xml:space="preserve"> på usikkerhet gjennom probabilistiske prognoser. Samtidig er det relativt få studier som eksplisitt sammenligner tradisjonelle tidsseriemetoder og KI-modeller for </w:t>
+      </w:r>
+      <w:r>
+        <w:rPr>
+          <w:rStyle w:val="Sterk"/>
+        </w:rPr>
+        <w:t xml:space="preserve">operasjonelle </w:t>
+      </w:r>
+      <w:proofErr w:type="spellStart"/>
+      <w:r>
+        <w:rPr>
+          <w:rStyle w:val="Sterk"/>
+        </w:rPr>
+        <w:t>offhire</w:t>
+      </w:r>
+      <w:proofErr w:type="spellEnd"/>
+      <w:r>
+        <w:rPr>
+          <w:rStyle w:val="Sterk"/>
+        </w:rPr>
+        <w:t>-hendelser på fartøynivå i PSV-segmentet</w:t>
+      </w:r>
+      <w:r>
+        <w:t xml:space="preserve">. Denne rapporten posisjonerer seg derfor i skjæringspunktet mellom prediktiv logistikk og maritim/offshore operasjonell risiko, ved å evaluere hvordan modellvalg påvirker prediksjonsytelse for </w:t>
+      </w:r>
+      <w:proofErr w:type="spellStart"/>
+      <w:r>
+        <w:t>offhire</w:t>
+      </w:r>
+      <w:proofErr w:type="spellEnd"/>
+      <w:r>
+        <w:t xml:space="preserve"> i PSV.</w:t>
+      </w:r>
+    </w:p>
+    <w:p/>
+    <w:p/>
+    <w:p>
       <w:r>
         <w:t xml:space="preserve">Diskuter de viktigste bidragene de 5 siste årene innen temaet du har valgt. Prøv å trekk tråder til din problemstilling og beskriv hvor og hvordan din rapport forholder seg til disse. Pass på at referanser blir korrekte. </w:t>
       </w:r>
@@ -7802,6 +8255,7 @@
       </w:pPr>
       <w:bookmarkStart w:id="24" w:name="_Toc222057412"/>
       <w:r>
+        <w:lastRenderedPageBreak/>
         <w:t>Metode</w:t>
       </w:r>
       <w:bookmarkEnd w:id="24"/>
@@ -7820,7 +8274,6 @@
     </w:p>
     <w:p>
       <w:r>
-        <w:lastRenderedPageBreak/>
         <w:t>Oppgi paradigme betraktninger, forskningsperspektiv, forskningsdesign, innsamlingsmetode for data, utvalgskriterier, utvalgsmetode, utvalgsstørrelse og analysemetoder.</w:t>
       </w:r>
     </w:p>
@@ -8108,7 +8561,6 @@
         </w:numPr>
       </w:pPr>
       <w:r>
-        <w:lastRenderedPageBreak/>
         <w:t>Data fra ERP-systemet: Periode-antall observasjoner rå data</w:t>
       </w:r>
       <w:r>
@@ -8302,6 +8754,7 @@
         </w:numPr>
       </w:pPr>
       <w:r>
+        <w:lastRenderedPageBreak/>
         <w:t>Dersom dette er et eget kapittel så skal dere her kun presentere resultatene i form av tabeller og/eller figurer.</w:t>
       </w:r>
     </w:p>
@@ -8357,7 +8810,6 @@
         </w:numPr>
       </w:pPr>
       <w:r>
-        <w:lastRenderedPageBreak/>
         <w:t>Endre forskningsspørsmålet slik at det er samsvar med analysene</w:t>
       </w:r>
     </w:p>
@@ -8529,6 +8981,7 @@
         </w:numPr>
       </w:pPr>
       <w:r>
+        <w:lastRenderedPageBreak/>
         <w:t xml:space="preserve">Resultatene diskuteres opp mot </w:t>
       </w:r>
       <w:proofErr w:type="gramStart"/>
@@ -8603,7 +9056,6 @@
         </w:numPr>
       </w:pPr>
       <w:r>
-        <w:lastRenderedPageBreak/>
         <w:t>Ta med begrensinger/svakheter i oppgaven</w:t>
       </w:r>
     </w:p>
@@ -13071,7 +13523,7 @@
     <w:lsdException w:name="Block Text" w:semiHidden="1" w:unhideWhenUsed="1"/>
     <w:lsdException w:name="Hyperlink" w:semiHidden="1" w:uiPriority="99" w:unhideWhenUsed="1"/>
     <w:lsdException w:name="FollowedHyperlink" w:semiHidden="1" w:unhideWhenUsed="1"/>
-    <w:lsdException w:name="Strong" w:qFormat="1"/>
+    <w:lsdException w:name="Strong" w:uiPriority="22" w:qFormat="1"/>
     <w:lsdException w:name="Emphasis" w:qFormat="1"/>
     <w:lsdException w:name="Document Map" w:semiHidden="1" w:unhideWhenUsed="1"/>
     <w:lsdException w:name="Plain Text" w:semiHidden="1" w:unhideWhenUsed="1"/>
@@ -14009,6 +14461,17 @@
       <w:lang w:eastAsia="zh-CN" w:bidi="or-IN"/>
     </w:rPr>
   </w:style>
+  <w:style w:type="character" w:styleId="Sterk">
+    <w:name w:val="Strong"/>
+    <w:basedOn w:val="Standardskriftforavsnitt"/>
+    <w:uiPriority w:val="22"/>
+    <w:qFormat/>
+    <w:rsid w:val="00021BD6"/>
+    <w:rPr>
+      <w:b/>
+      <w:bCs/>
+    </w:rPr>
+  </w:style>
 </w:styles>
 </file>
 
@@ -14274,21 +14737,6 @@
 </file>
 
 <file path=customXml/item1.xml><?xml version="1.0" encoding="utf-8"?>
-<?mso-contentType ?>
-<FormTemplates xmlns="http://schemas.microsoft.com/sharepoint/v3/contenttype/forms">
-  <Display>DocumentLibraryForm</Display>
-  <Edit>DocumentLibraryForm</Edit>
-  <New>DocumentLibraryForm</New>
-</FormTemplates>
-</file>
-
-<file path=customXml/item2.xml><?xml version="1.0" encoding="utf-8"?>
-<p:properties xmlns:p="http://schemas.microsoft.com/office/2006/metadata/properties" xmlns:xsi="http://www.w3.org/2001/XMLSchema-instance" xmlns:pc="http://schemas.microsoft.com/office/infopath/2007/PartnerControls">
-  <documentManagement/>
-</p:properties>
-</file>
-
-<file path=customXml/item3.xml><?xml version="1.0" encoding="utf-8"?>
 <ct:contentTypeSchema xmlns:ct="http://schemas.microsoft.com/office/2006/metadata/contentType" xmlns:ma="http://schemas.microsoft.com/office/2006/metadata/properties/metaAttributes" ct:_="" ma:_="" ma:contentTypeName="Dokument" ma:contentTypeID="0x010100EEC585885EB71F4DB0D9FB45E4A66F2C" ma:contentTypeVersion="3" ma:contentTypeDescription="Opprett et nytt dokument." ma:contentTypeScope="" ma:versionID="f382b6a2fd235f283bf5cecf5e56262d">
   <xsd:schema xmlns:xsd="http://www.w3.org/2001/XMLSchema" xmlns:xs="http://www.w3.org/2001/XMLSchema" xmlns:p="http://schemas.microsoft.com/office/2006/metadata/properties" xmlns:ns2="e2dd498c-680f-4fa4-b475-961296ca3ef1" targetNamespace="http://schemas.microsoft.com/office/2006/metadata/properties" ma:root="true" ma:fieldsID="c7bc32ed49db3fd258cd61b46b16d772" ns2:_="">
     <xsd:import namespace="e2dd498c-680f-4fa4-b475-961296ca3ef1"/>
@@ -14426,6 +14874,21 @@
 </ct:contentTypeSchema>
 </file>
 
+<file path=customXml/item2.xml><?xml version="1.0" encoding="utf-8"?>
+<p:properties xmlns:p="http://schemas.microsoft.com/office/2006/metadata/properties" xmlns:xsi="http://www.w3.org/2001/XMLSchema-instance" xmlns:pc="http://schemas.microsoft.com/office/infopath/2007/PartnerControls">
+  <documentManagement/>
+</p:properties>
+</file>
+
+<file path=customXml/item3.xml><?xml version="1.0" encoding="utf-8"?>
+<?mso-contentType ?>
+<FormTemplates xmlns="http://schemas.microsoft.com/sharepoint/v3/contenttype/forms">
+  <Display>DocumentLibraryForm</Display>
+  <Edit>DocumentLibraryForm</Edit>
+  <New>DocumentLibraryForm</New>
+</FormTemplates>
+</file>
+
 <file path=customXml/item4.xml><?xml version="1.0" encoding="utf-8"?>
 <b:Sources xmlns:b="http://schemas.openxmlformats.org/officeDocument/2006/bibliography" xmlns="http://schemas.openxmlformats.org/officeDocument/2006/bibliography" SelectedStyle="/APASixthEditionOfficeOnline.xsl" StyleName="APA" Version="6">
   <b:Source>
@@ -14528,23 +14991,6 @@
 </file>
 
 <file path=customXml/itemProps1.xml><?xml version="1.0" encoding="utf-8"?>
-<ds:datastoreItem xmlns:ds="http://schemas.openxmlformats.org/officeDocument/2006/customXml" ds:itemID="{15EDDDC4-FC70-4A17-B335-FA74CBA6D896}">
-  <ds:schemaRefs>
-    <ds:schemaRef ds:uri="http://schemas.microsoft.com/sharepoint/v3/contenttype/forms"/>
-  </ds:schemaRefs>
-</ds:datastoreItem>
-</file>
-
-<file path=customXml/itemProps2.xml><?xml version="1.0" encoding="utf-8"?>
-<ds:datastoreItem xmlns:ds="http://schemas.openxmlformats.org/officeDocument/2006/customXml" ds:itemID="{74AFE97E-FF41-453C-AD97-D425FF5A45AF}">
-  <ds:schemaRefs>
-    <ds:schemaRef ds:uri="http://schemas.microsoft.com/office/2006/metadata/properties"/>
-    <ds:schemaRef ds:uri="http://schemas.microsoft.com/office/infopath/2007/PartnerControls"/>
-  </ds:schemaRefs>
-</ds:datastoreItem>
-</file>
-
-<file path=customXml/itemProps3.xml><?xml version="1.0" encoding="utf-8"?>
 <ds:datastoreItem xmlns:ds="http://schemas.openxmlformats.org/officeDocument/2006/customXml" ds:itemID="{F04B31DB-3A04-4C67-AFC6-FB4D572DB88B}">
   <ds:schemaRefs>
     <ds:schemaRef ds:uri="http://schemas.microsoft.com/office/2006/metadata/contentType"/>
@@ -14562,6 +15008,23 @@
 </ds:datastoreItem>
 </file>
 
+<file path=customXml/itemProps2.xml><?xml version="1.0" encoding="utf-8"?>
+<ds:datastoreItem xmlns:ds="http://schemas.openxmlformats.org/officeDocument/2006/customXml" ds:itemID="{74AFE97E-FF41-453C-AD97-D425FF5A45AF}">
+  <ds:schemaRefs>
+    <ds:schemaRef ds:uri="http://schemas.microsoft.com/office/2006/metadata/properties"/>
+    <ds:schemaRef ds:uri="http://schemas.microsoft.com/office/infopath/2007/PartnerControls"/>
+  </ds:schemaRefs>
+</ds:datastoreItem>
+</file>
+
+<file path=customXml/itemProps3.xml><?xml version="1.0" encoding="utf-8"?>
+<ds:datastoreItem xmlns:ds="http://schemas.openxmlformats.org/officeDocument/2006/customXml" ds:itemID="{15EDDDC4-FC70-4A17-B335-FA74CBA6D896}">
+  <ds:schemaRefs>
+    <ds:schemaRef ds:uri="http://schemas.microsoft.com/sharepoint/v3/contenttype/forms"/>
+  </ds:schemaRefs>
+</ds:datastoreItem>
+</file>
+
 <file path=customXml/itemProps4.xml><?xml version="1.0" encoding="utf-8"?>
 <ds:datastoreItem xmlns:ds="http://schemas.openxmlformats.org/officeDocument/2006/customXml" ds:itemID="{16711374-8990-FF4C-B9C0-EDF9999C5205}">
   <ds:schemaRefs>

</xml_diff>